<commit_message>
ex 9 be si analiza
</commit_message>
<xml_diff>
--- a/MODBD/ADA_Analiza.docx
+++ b/MODBD/ADA_Analiza.docx
@@ -334,12 +334,17 @@
         <w:t xml:space="preserve"> </w:t>
       </w:r>
       <w:proofErr w:type="spellStart"/>
+      <w:proofErr w:type="gramStart"/>
       <w:r>
         <w:t>suplimentare</w:t>
       </w:r>
       <w:proofErr w:type="spellEnd"/>
       <w:r>
-        <w:t xml:space="preserve">(spa, fitness, </w:t>
+        <w:t>(</w:t>
+      </w:r>
+      <w:proofErr w:type="gramEnd"/>
+      <w:r>
+        <w:t xml:space="preserve">spa, fitness, </w:t>
       </w:r>
       <w:proofErr w:type="spellStart"/>
       <w:r>
@@ -615,13 +620,18 @@
       </w:r>
       <w:proofErr w:type="spellEnd"/>
       <w:r>
-        <w:t xml:space="preserve"> a  </w:t>
+        <w:t xml:space="preserve"> </w:t>
+      </w:r>
+      <w:proofErr w:type="gramStart"/>
+      <w:r>
+        <w:t xml:space="preserve">a  </w:t>
       </w:r>
       <w:proofErr w:type="spellStart"/>
       <w:r>
         <w:t>activitatii</w:t>
       </w:r>
       <w:proofErr w:type="spellEnd"/>
+      <w:proofErr w:type="gramEnd"/>
       <w:r>
         <w:t xml:space="preserve"> </w:t>
       </w:r>
@@ -1373,10 +1383,12 @@
           <w:lang w:val="en-US"/>
         </w:rPr>
       </w:pPr>
+      <w:proofErr w:type="gramStart"/>
       <w:r>
         <w:t>HOTEL(</w:t>
       </w:r>
       <w:proofErr w:type="spellStart"/>
+      <w:proofErr w:type="gramEnd"/>
       <w:r>
         <w:t>id_hotel</w:t>
       </w:r>
@@ -4490,7 +4502,23 @@
         </w:rPr>
       </w:pPr>
       <w:r>
-        <w:t>HOTEL2 = σ(oras = 'Constanța')(HOTEL)</w:t>
+        <w:t xml:space="preserve">HOTEL2 = </w:t>
+      </w:r>
+      <w:proofErr w:type="gramStart"/>
+      <w:r>
+        <w:t>σ(</w:t>
+      </w:r>
+      <w:proofErr w:type="gramEnd"/>
+      <w:r>
+        <w:t>oras = 'Constanța</w:t>
+      </w:r>
+      <w:proofErr w:type="gramStart"/>
+      <w:r>
+        <w:t>')(</w:t>
+      </w:r>
+      <w:proofErr w:type="gramEnd"/>
+      <w:r>
+        <w:t>HOTEL)</w:t>
       </w:r>
     </w:p>
     <w:p>
@@ -15126,6 +15154,370 @@
         </w:rPr>
         <w:t xml:space="preserve"> Formularea în limbaj natural a unei cereri SQL complexe care va folosi date din mai multe fragmente și va fi optimizată în etapa de implementare. Precizarea tehnicilor de optimizare ce ar putea fi utilizate pentru această cerere particulară (avantaje / dezavantaje de utilizare pentru o anumită tehnică)</w:t>
       </w:r>
+    </w:p>
+    <w:p>
+      <w:pPr>
+        <w:rPr>
+          <w:noProof/>
+          <w:lang w:val="en-US"/>
+        </w:rPr>
+      </w:pPr>
+      <w:r>
+        <w:rPr>
+          <w:b/>
+          <w:bCs/>
+          <w:noProof/>
+          <w:lang w:val="en-US"/>
+        </w:rPr>
+        <w:t xml:space="preserve">Cerere </w:t>
+      </w:r>
+      <w:r>
+        <w:rPr>
+          <w:b/>
+          <w:bCs/>
+          <w:noProof/>
+          <w:lang w:val="ro-RO"/>
+        </w:rPr>
+        <w:t>în limbaj natural</w:t>
+      </w:r>
+      <w:r>
+        <w:rPr>
+          <w:b/>
+          <w:bCs/>
+          <w:noProof/>
+          <w:lang w:val="en-US"/>
+        </w:rPr>
+        <w:t>:</w:t>
+      </w:r>
+      <w:r>
+        <w:rPr>
+          <w:b/>
+          <w:bCs/>
+          <w:noProof/>
+          <w:lang w:val="en-US"/>
+        </w:rPr>
+        <w:t xml:space="preserve"> </w:t>
+      </w:r>
+      <w:r>
+        <w:rPr>
+          <w:noProof/>
+          <w:lang w:val="en-US"/>
+        </w:rPr>
+        <w:t>Să se afișeze numele, prenumele și funcția angajaților care lucrează în departamentul cu numele ’Spa &amp; Wellness’ și care au salariul mai mare de 2000 lei.</w:t>
+      </w:r>
+    </w:p>
+    <w:p>
+      <w:pPr>
+        <w:rPr>
+          <w:b/>
+          <w:bCs/>
+          <w:noProof/>
+          <w:lang w:val="en-US"/>
+        </w:rPr>
+      </w:pPr>
+      <w:r>
+        <w:rPr>
+          <w:b/>
+          <w:bCs/>
+          <w:noProof/>
+          <w:lang w:val="en-US"/>
+        </w:rPr>
+        <w:t>Tehnici de optimizare:</w:t>
+      </w:r>
+    </w:p>
+    <w:p>
+      <w:pPr>
+        <w:numPr>
+          <w:ilvl w:val="0"/>
+          <w:numId w:val="11"/>
+        </w:numPr>
+        <w:spacing w:after="0"/>
+        <w:jc w:val="both"/>
+        <w:rPr>
+          <w:b/>
+          <w:bCs/>
+        </w:rPr>
+      </w:pPr>
+      <w:r>
+        <w:rPr>
+          <w:b/>
+          <w:bCs/>
+        </w:rPr>
+        <w:t xml:space="preserve">B-Tree </w:t>
+      </w:r>
+      <w:proofErr w:type="spellStart"/>
+      <w:r>
+        <w:rPr>
+          <w:b/>
+          <w:bCs/>
+        </w:rPr>
+        <w:t>Index</w:t>
+      </w:r>
+      <w:proofErr w:type="spellEnd"/>
+      <w:r>
+        <w:rPr>
+          <w:b/>
+          <w:bCs/>
+        </w:rPr>
+        <w:t xml:space="preserve"> pe </w:t>
+      </w:r>
+      <w:proofErr w:type="spellStart"/>
+      <w:r>
+        <w:rPr>
+          <w:b/>
+          <w:bCs/>
+        </w:rPr>
+        <w:t>coloana</w:t>
+      </w:r>
+      <w:proofErr w:type="spellEnd"/>
+      <w:r>
+        <w:t xml:space="preserve"> </w:t>
+      </w:r>
+      <w:proofErr w:type="spellStart"/>
+      <w:proofErr w:type="gramStart"/>
+      <w:r>
+        <w:rPr>
+          <w:b/>
+          <w:bCs/>
+        </w:rPr>
+        <w:t>departament.nume</w:t>
+      </w:r>
+      <w:proofErr w:type="gramEnd"/>
+      <w:r>
+        <w:rPr>
+          <w:b/>
+          <w:bCs/>
+        </w:rPr>
+        <w:t>_departament</w:t>
+      </w:r>
+      <w:proofErr w:type="spellEnd"/>
+    </w:p>
+    <w:p>
+      <w:pPr>
+        <w:ind w:left="1080"/>
+        <w:jc w:val="both"/>
+      </w:pPr>
+      <w:r>
+        <w:t>DEPARTAMENT (</w:t>
+      </w:r>
+      <w:proofErr w:type="spellStart"/>
+      <w:r>
+        <w:t>nume_departamen</w:t>
+      </w:r>
+      <w:r>
+        <w:t>t</w:t>
+      </w:r>
+      <w:proofErr w:type="spellEnd"/>
+      <w:r>
+        <w:t>)</w:t>
+      </w:r>
+    </w:p>
+    <w:tbl>
+      <w:tblPr>
+        <w:tblW w:w="9936" w:type="dxa"/>
+        <w:tblInd w:w="972" w:type="dxa"/>
+        <w:tblBorders>
+          <w:top w:val="single" w:sz="4" w:space="0" w:color="000000"/>
+          <w:left w:val="single" w:sz="4" w:space="0" w:color="000000"/>
+          <w:bottom w:val="single" w:sz="4" w:space="0" w:color="000000"/>
+          <w:right w:val="single" w:sz="4" w:space="0" w:color="000000"/>
+          <w:insideH w:val="single" w:sz="4" w:space="0" w:color="000000"/>
+          <w:insideV w:val="single" w:sz="4" w:space="0" w:color="000000"/>
+        </w:tblBorders>
+        <w:tblLayout w:type="fixed"/>
+        <w:tblLook w:val="0400" w:firstRow="0" w:lastRow="0" w:firstColumn="0" w:lastColumn="0" w:noHBand="0" w:noVBand="1"/>
+      </w:tblPr>
+      <w:tblGrid>
+        <w:gridCol w:w="4902"/>
+        <w:gridCol w:w="5034"/>
+      </w:tblGrid>
+      <w:tr>
+        <w:tc>
+          <w:tcPr>
+            <w:tcW w:w="4902" w:type="dxa"/>
+            <w:shd w:val="clear" w:color="auto" w:fill="B8CCE4"/>
+          </w:tcPr>
+          <w:p>
+            <w:pPr>
+              <w:spacing w:after="0" w:line="240" w:lineRule="auto"/>
+              <w:jc w:val="both"/>
+            </w:pPr>
+            <w:proofErr w:type="spellStart"/>
+            <w:r>
+              <w:t>Avantaj</w:t>
+            </w:r>
+            <w:proofErr w:type="spellEnd"/>
+          </w:p>
+        </w:tc>
+        <w:tc>
+          <w:tcPr>
+            <w:tcW w:w="5034" w:type="dxa"/>
+            <w:shd w:val="clear" w:color="auto" w:fill="B8CCE4"/>
+          </w:tcPr>
+          <w:p>
+            <w:pPr>
+              <w:spacing w:after="0" w:line="240" w:lineRule="auto"/>
+              <w:jc w:val="both"/>
+            </w:pPr>
+            <w:proofErr w:type="spellStart"/>
+            <w:r>
+              <w:t>Dezavantaj</w:t>
+            </w:r>
+            <w:proofErr w:type="spellEnd"/>
+          </w:p>
+        </w:tc>
+      </w:tr>
+      <w:tr>
+        <w:tc>
+          <w:tcPr>
+            <w:tcW w:w="4902" w:type="dxa"/>
+          </w:tcPr>
+          <w:p>
+            <w:pPr>
+              <w:spacing w:after="0" w:line="240" w:lineRule="auto"/>
+              <w:jc w:val="both"/>
+            </w:pPr>
+          </w:p>
+          <w:p>
+            <w:pPr>
+              <w:spacing w:after="0" w:line="240" w:lineRule="auto"/>
+              <w:jc w:val="both"/>
+              <w:rPr>
+                <w:lang w:val="ro-RO"/>
+              </w:rPr>
+            </w:pPr>
+            <w:proofErr w:type="spellStart"/>
+            <w:r>
+              <w:t>Reducerea</w:t>
+            </w:r>
+            <w:proofErr w:type="spellEnd"/>
+            <w:r>
+              <w:t xml:space="preserve"> </w:t>
+            </w:r>
+            <w:proofErr w:type="spellStart"/>
+            <w:r>
+              <w:t>timpului</w:t>
+            </w:r>
+            <w:proofErr w:type="spellEnd"/>
+            <w:r>
+              <w:t xml:space="preserve"> de c</w:t>
+            </w:r>
+            <w:proofErr w:type="spellStart"/>
+            <w:r>
+              <w:rPr>
+                <w:lang w:val="ro-RO"/>
+              </w:rPr>
+              <w:t>ăutare</w:t>
+            </w:r>
+            <w:proofErr w:type="spellEnd"/>
+            <w:r>
+              <w:rPr>
+                <w:lang w:val="ro-RO"/>
+              </w:rPr>
+              <w:t xml:space="preserve"> în tabel, deoarece nu se mai face FULL TABLE SCAN.</w:t>
+            </w:r>
+          </w:p>
+        </w:tc>
+        <w:tc>
+          <w:tcPr>
+            <w:tcW w:w="5034" w:type="dxa"/>
+          </w:tcPr>
+          <w:p>
+            <w:pPr>
+              <w:spacing w:after="0" w:line="240" w:lineRule="auto"/>
+              <w:jc w:val="both"/>
+            </w:pPr>
+          </w:p>
+          <w:p>
+            <w:pPr>
+              <w:spacing w:after="0" w:line="240" w:lineRule="auto"/>
+              <w:jc w:val="both"/>
+            </w:pPr>
+            <w:proofErr w:type="spellStart"/>
+            <w:r>
+              <w:t>Ocupă</w:t>
+            </w:r>
+            <w:proofErr w:type="spellEnd"/>
+            <w:r>
+              <w:t xml:space="preserve"> </w:t>
+            </w:r>
+            <w:proofErr w:type="spellStart"/>
+            <w:r>
+              <w:t>spațiu</w:t>
+            </w:r>
+            <w:proofErr w:type="spellEnd"/>
+            <w:r>
+              <w:t xml:space="preserve"> </w:t>
+            </w:r>
+            <w:proofErr w:type="spellStart"/>
+            <w:r>
+              <w:t>suplimentar</w:t>
+            </w:r>
+            <w:proofErr w:type="spellEnd"/>
+            <w:r>
+              <w:t xml:space="preserve"> </w:t>
+            </w:r>
+            <w:proofErr w:type="spellStart"/>
+            <w:r>
+              <w:t>și</w:t>
+            </w:r>
+            <w:proofErr w:type="spellEnd"/>
+            <w:r>
+              <w:t xml:space="preserve"> </w:t>
+            </w:r>
+            <w:proofErr w:type="spellStart"/>
+            <w:r>
+              <w:t>inserțiile</w:t>
+            </w:r>
+            <w:proofErr w:type="spellEnd"/>
+            <w:r>
+              <w:t>/</w:t>
+            </w:r>
+            <w:proofErr w:type="spellStart"/>
+            <w:r>
+              <w:t>actualizările</w:t>
+            </w:r>
+            <w:proofErr w:type="spellEnd"/>
+            <w:r>
+              <w:t xml:space="preserve"> </w:t>
+            </w:r>
+            <w:proofErr w:type="spellStart"/>
+            <w:r>
+              <w:t>pot</w:t>
+            </w:r>
+            <w:proofErr w:type="spellEnd"/>
+            <w:r>
+              <w:t xml:space="preserve"> fi </w:t>
+            </w:r>
+            <w:proofErr w:type="spellStart"/>
+            <w:r>
+              <w:t>mai</w:t>
+            </w:r>
+            <w:proofErr w:type="spellEnd"/>
+            <w:r>
+              <w:t xml:space="preserve"> lente.</w:t>
+            </w:r>
+          </w:p>
+        </w:tc>
+      </w:tr>
+    </w:tbl>
+    <w:p>
+      <w:pPr>
+        <w:rPr>
+          <w:b/>
+          <w:bCs/>
+          <w:noProof/>
+          <w:lang w:val="en-US"/>
+        </w:rPr>
+      </w:pPr>
+    </w:p>
+    <w:p>
+      <w:pPr>
+        <w:rPr>
+          <w:noProof/>
+          <w:lang w:val="en-US"/>
+        </w:rPr>
+      </w:pPr>
     </w:p>
     <w:sectPr>
       <w:headerReference w:type="default" r:id="rId10"/>

</xml_diff>

<commit_message>
[fix] fragmentat oras, adaugat restul de contrangeri fk
</commit_message>
<xml_diff>
--- a/MODBD/ADA_Analiza.docx
+++ b/MODBD/ADA_Analiza.docx
@@ -64,7 +64,6 @@
         </w:rPr>
         <w:tab/>
       </w:r>
-      <w:proofErr w:type="spellStart"/>
       <w:r>
         <w:rPr>
           <w:rFonts w:ascii="Calibri" w:eastAsia="Calibri" w:hAnsi="Calibri" w:cs="Calibri"/>
@@ -75,35 +74,8 @@
           <w:szCs w:val="28"/>
           <w:highlight w:val="lightGray"/>
         </w:rPr>
-        <w:t>Raportul</w:t>
-      </w:r>
-      <w:proofErr w:type="spellEnd"/>
-      <w:r>
-        <w:rPr>
-          <w:rFonts w:ascii="Calibri" w:eastAsia="Calibri" w:hAnsi="Calibri" w:cs="Calibri"/>
-          <w:b/>
-          <w:bCs/>
-          <w:color w:val="000000"/>
-          <w:sz w:val="28"/>
-          <w:szCs w:val="28"/>
-          <w:highlight w:val="lightGray"/>
-        </w:rPr>
-        <w:t xml:space="preserve"> de </w:t>
-      </w:r>
-      <w:proofErr w:type="spellStart"/>
-      <w:r>
-        <w:rPr>
-          <w:rFonts w:ascii="Calibri" w:eastAsia="Calibri" w:hAnsi="Calibri" w:cs="Calibri"/>
-          <w:b/>
-          <w:bCs/>
-          <w:color w:val="000000"/>
-          <w:sz w:val="28"/>
-          <w:szCs w:val="28"/>
-          <w:highlight w:val="lightGray"/>
-        </w:rPr>
-        <w:t>analiză</w:t>
-      </w:r>
-      <w:proofErr w:type="spellEnd"/>
+        <w:t>Raportul de analiză</w:t>
+      </w:r>
     </w:p>
     <w:p>
       <w:r>
@@ -120,47 +92,13 @@
       </w:r>
     </w:p>
     <w:p>
-      <w:proofErr w:type="spellStart"/>
       <w:r>
         <w:rPr>
           <w:b/>
           <w:bCs/>
         </w:rPr>
-        <w:t>Cerințe</w:t>
-      </w:r>
-      <w:proofErr w:type="spellEnd"/>
-      <w:r>
-        <w:rPr>
-          <w:b/>
-          <w:bCs/>
-        </w:rPr>
-        <w:t xml:space="preserve"> </w:t>
-      </w:r>
-      <w:proofErr w:type="spellStart"/>
-      <w:r>
-        <w:rPr>
-          <w:b/>
-          <w:bCs/>
-        </w:rPr>
-        <w:t>Raport</w:t>
-      </w:r>
-      <w:proofErr w:type="spellEnd"/>
-      <w:r>
-        <w:rPr>
-          <w:b/>
-          <w:bCs/>
-        </w:rPr>
-        <w:t xml:space="preserve"> </w:t>
-      </w:r>
-      <w:proofErr w:type="spellStart"/>
-      <w:r>
-        <w:rPr>
-          <w:b/>
-          <w:bCs/>
-        </w:rPr>
-        <w:t>Analiză</w:t>
-      </w:r>
-      <w:proofErr w:type="spellEnd"/>
+        <w:t>Cerințe Raport Analiză</w:t>
+      </w:r>
       <w:r>
         <w:t> </w:t>
       </w:r>
@@ -179,469 +117,36 @@
         </w:rPr>
         <w:t xml:space="preserve">(0,25p) </w:t>
       </w:r>
-      <w:proofErr w:type="spellStart"/>
-      <w:r>
-        <w:t>Descrierea</w:t>
-      </w:r>
-      <w:proofErr w:type="spellEnd"/>
-      <w:r>
-        <w:t xml:space="preserve"> </w:t>
-      </w:r>
-      <w:proofErr w:type="spellStart"/>
-      <w:r>
-        <w:t>modelului</w:t>
-      </w:r>
-      <w:proofErr w:type="spellEnd"/>
-      <w:r>
-        <w:t xml:space="preserve"> ales </w:t>
-      </w:r>
-      <w:proofErr w:type="spellStart"/>
-      <w:r>
-        <w:t>și</w:t>
-      </w:r>
-      <w:proofErr w:type="spellEnd"/>
-      <w:r>
-        <w:t xml:space="preserve"> a </w:t>
-      </w:r>
-      <w:proofErr w:type="spellStart"/>
-      <w:r>
-        <w:t>obiectivelor</w:t>
-      </w:r>
-      <w:proofErr w:type="spellEnd"/>
-      <w:r>
-        <w:t xml:space="preserve"> </w:t>
-      </w:r>
-      <w:proofErr w:type="spellStart"/>
-      <w:r>
-        <w:t>aplicației</w:t>
-      </w:r>
-      <w:proofErr w:type="spellEnd"/>
-      <w:r>
-        <w:t xml:space="preserve"> - </w:t>
-      </w:r>
-      <w:proofErr w:type="spellStart"/>
+      <w:r>
+        <w:t xml:space="preserve">Descrierea modelului ales și a obiectivelor aplicației - </w:t>
+      </w:r>
       <w:r>
         <w:rPr>
           <w:b/>
           <w:bCs/>
         </w:rPr>
-        <w:t>obligatoriu</w:t>
-      </w:r>
-      <w:proofErr w:type="spellEnd"/>
-      <w:r>
-        <w:rPr>
-          <w:b/>
-          <w:bCs/>
-        </w:rPr>
-        <w:t xml:space="preserve"> </w:t>
-      </w:r>
-    </w:p>
-    <w:p>
-      <w:proofErr w:type="spellStart"/>
-      <w:r>
-        <w:t>Modelul</w:t>
-      </w:r>
-      <w:proofErr w:type="spellEnd"/>
-      <w:r>
-        <w:t xml:space="preserve"> de </w:t>
-      </w:r>
-      <w:proofErr w:type="spellStart"/>
-      <w:r>
-        <w:t>bază</w:t>
-      </w:r>
-      <w:proofErr w:type="spellEnd"/>
-      <w:r>
-        <w:t xml:space="preserve"> de date </w:t>
-      </w:r>
-      <w:proofErr w:type="spellStart"/>
-      <w:r>
-        <w:t>reprezinta</w:t>
-      </w:r>
-      <w:proofErr w:type="spellEnd"/>
-      <w:r>
-        <w:t xml:space="preserve"> un </w:t>
-      </w:r>
-      <w:proofErr w:type="spellStart"/>
-      <w:r>
-        <w:t>sistem</w:t>
-      </w:r>
-      <w:proofErr w:type="spellEnd"/>
-      <w:r>
-        <w:t xml:space="preserve"> de </w:t>
-      </w:r>
-      <w:proofErr w:type="spellStart"/>
-      <w:r>
-        <w:t>gestiune</w:t>
-      </w:r>
-      <w:proofErr w:type="spellEnd"/>
-      <w:r>
-        <w:t xml:space="preserve"> </w:t>
-      </w:r>
-      <w:proofErr w:type="spellStart"/>
-      <w:r>
-        <w:t>pentru</w:t>
-      </w:r>
-      <w:proofErr w:type="spellEnd"/>
-      <w:r>
-        <w:t xml:space="preserve"> o </w:t>
-      </w:r>
-      <w:proofErr w:type="spellStart"/>
-      <w:r>
-        <w:t>unitate</w:t>
-      </w:r>
-      <w:proofErr w:type="spellEnd"/>
-      <w:r>
-        <w:t xml:space="preserve"> </w:t>
-      </w:r>
-      <w:proofErr w:type="spellStart"/>
-      <w:r>
-        <w:t>hoteliera</w:t>
-      </w:r>
-      <w:proofErr w:type="spellEnd"/>
-      <w:r>
-        <w:t xml:space="preserve"> care </w:t>
-      </w:r>
-      <w:proofErr w:type="spellStart"/>
-      <w:r>
-        <w:t>ofera</w:t>
-      </w:r>
-      <w:proofErr w:type="spellEnd"/>
-      <w:r>
-        <w:t xml:space="preserve"> </w:t>
-      </w:r>
-      <w:proofErr w:type="spellStart"/>
-      <w:r>
-        <w:t>servicii</w:t>
-      </w:r>
-      <w:proofErr w:type="spellEnd"/>
-      <w:r>
-        <w:t xml:space="preserve"> de cazare, organizare </w:t>
-      </w:r>
-      <w:proofErr w:type="spellStart"/>
-      <w:r>
-        <w:t>evenimente</w:t>
-      </w:r>
-      <w:proofErr w:type="spellEnd"/>
-      <w:r>
-        <w:t xml:space="preserve"> si </w:t>
-      </w:r>
-      <w:proofErr w:type="spellStart"/>
-      <w:r>
-        <w:t>servicii</w:t>
-      </w:r>
-      <w:proofErr w:type="spellEnd"/>
-      <w:r>
-        <w:t xml:space="preserve"> </w:t>
-      </w:r>
-      <w:proofErr w:type="spellStart"/>
-      <w:proofErr w:type="gramStart"/>
-      <w:r>
-        <w:t>suplimentare</w:t>
-      </w:r>
-      <w:proofErr w:type="spellEnd"/>
-      <w:r>
-        <w:t>(</w:t>
-      </w:r>
-      <w:proofErr w:type="gramEnd"/>
-      <w:r>
-        <w:t xml:space="preserve">spa, fitness, </w:t>
-      </w:r>
-      <w:proofErr w:type="spellStart"/>
-      <w:r>
-        <w:t>etc</w:t>
-      </w:r>
-      <w:proofErr w:type="spellEnd"/>
-      <w:r>
-        <w:t>).</w:t>
-      </w:r>
-    </w:p>
-    <w:p>
-      <w:proofErr w:type="spellStart"/>
-      <w:r>
-        <w:t>Sistemul</w:t>
-      </w:r>
-      <w:proofErr w:type="spellEnd"/>
-      <w:r>
-        <w:t xml:space="preserve"> OLTP are </w:t>
-      </w:r>
-      <w:proofErr w:type="spellStart"/>
-      <w:r>
-        <w:t>rolul</w:t>
-      </w:r>
-      <w:proofErr w:type="spellEnd"/>
-      <w:r>
-        <w:t xml:space="preserve"> de a </w:t>
-      </w:r>
-      <w:proofErr w:type="spellStart"/>
-      <w:r>
-        <w:t>asigura</w:t>
-      </w:r>
-      <w:proofErr w:type="spellEnd"/>
-      <w:r>
-        <w:t xml:space="preserve"> </w:t>
-      </w:r>
-      <w:proofErr w:type="spellStart"/>
-      <w:r>
-        <w:t>gestionarea</w:t>
-      </w:r>
-      <w:proofErr w:type="spellEnd"/>
-      <w:r>
-        <w:t xml:space="preserve"> </w:t>
-      </w:r>
-      <w:proofErr w:type="spellStart"/>
-      <w:r>
-        <w:t>operatiunilor</w:t>
-      </w:r>
-      <w:proofErr w:type="spellEnd"/>
-      <w:r>
-        <w:t xml:space="preserve"> </w:t>
-      </w:r>
-      <w:proofErr w:type="spellStart"/>
-      <w:r>
-        <w:t>zilnice</w:t>
-      </w:r>
-      <w:proofErr w:type="spellEnd"/>
-      <w:r>
-        <w:t xml:space="preserve"> ale </w:t>
-      </w:r>
-      <w:proofErr w:type="spellStart"/>
-      <w:r>
-        <w:t>hotelului</w:t>
-      </w:r>
-      <w:proofErr w:type="spellEnd"/>
-      <w:r>
-        <w:t xml:space="preserve"> de la </w:t>
-      </w:r>
-      <w:proofErr w:type="spellStart"/>
-      <w:r>
-        <w:t>rezervarea</w:t>
-      </w:r>
-      <w:proofErr w:type="spellEnd"/>
-      <w:r>
-        <w:t xml:space="preserve"> </w:t>
-      </w:r>
-      <w:proofErr w:type="spellStart"/>
-      <w:r>
-        <w:t>camerelor</w:t>
-      </w:r>
-      <w:proofErr w:type="spellEnd"/>
-      <w:r>
-        <w:t xml:space="preserve"> si </w:t>
-      </w:r>
-      <w:proofErr w:type="spellStart"/>
-      <w:r>
-        <w:t>inregistrarea</w:t>
-      </w:r>
-      <w:proofErr w:type="spellEnd"/>
-      <w:r>
-        <w:t xml:space="preserve"> </w:t>
-      </w:r>
-      <w:proofErr w:type="spellStart"/>
-      <w:r>
-        <w:t>clientilor</w:t>
-      </w:r>
-      <w:proofErr w:type="spellEnd"/>
-      <w:r>
-        <w:t xml:space="preserve"> pana la </w:t>
-      </w:r>
-      <w:proofErr w:type="spellStart"/>
-      <w:r>
-        <w:t>procesarea</w:t>
-      </w:r>
-      <w:proofErr w:type="spellEnd"/>
-      <w:r>
-        <w:t xml:space="preserve"> </w:t>
-      </w:r>
-      <w:proofErr w:type="spellStart"/>
-      <w:r>
-        <w:t>platilor</w:t>
-      </w:r>
-      <w:proofErr w:type="spellEnd"/>
-      <w:r>
-        <w:t xml:space="preserve"> si </w:t>
-      </w:r>
-      <w:proofErr w:type="spellStart"/>
-      <w:r>
-        <w:t>gestionarea</w:t>
-      </w:r>
-      <w:proofErr w:type="spellEnd"/>
-      <w:r>
-        <w:t xml:space="preserve"> </w:t>
-      </w:r>
-      <w:proofErr w:type="spellStart"/>
-      <w:r>
-        <w:t>evenimentelor</w:t>
-      </w:r>
-      <w:proofErr w:type="spellEnd"/>
-      <w:r>
-        <w:t xml:space="preserve">. </w:t>
-      </w:r>
-      <w:proofErr w:type="spellStart"/>
-      <w:r>
-        <w:t>Principalele</w:t>
-      </w:r>
-      <w:proofErr w:type="spellEnd"/>
-      <w:r>
-        <w:t xml:space="preserve"> </w:t>
-      </w:r>
-      <w:proofErr w:type="spellStart"/>
-      <w:r>
-        <w:t>entitati</w:t>
-      </w:r>
-      <w:proofErr w:type="spellEnd"/>
-      <w:r>
-        <w:t xml:space="preserve"> </w:t>
-      </w:r>
-      <w:proofErr w:type="spellStart"/>
-      <w:r>
-        <w:t>implicatie</w:t>
-      </w:r>
-      <w:proofErr w:type="spellEnd"/>
-      <w:r>
-        <w:t xml:space="preserve"> in </w:t>
-      </w:r>
-      <w:proofErr w:type="spellStart"/>
-      <w:r>
-        <w:t>sistem</w:t>
-      </w:r>
-      <w:proofErr w:type="spellEnd"/>
-      <w:r>
-        <w:t xml:space="preserve"> sunt: </w:t>
-      </w:r>
-      <w:proofErr w:type="spellStart"/>
-      <w:r>
-        <w:t>Clienti</w:t>
-      </w:r>
-      <w:proofErr w:type="spellEnd"/>
-      <w:r>
-        <w:t xml:space="preserve">, </w:t>
-      </w:r>
-      <w:proofErr w:type="spellStart"/>
-      <w:r>
-        <w:t>Rezervari</w:t>
-      </w:r>
-      <w:proofErr w:type="spellEnd"/>
-      <w:r>
-        <w:t xml:space="preserve">, Camere, </w:t>
-      </w:r>
-      <w:proofErr w:type="spellStart"/>
-      <w:r>
-        <w:t>Servicii</w:t>
-      </w:r>
-      <w:proofErr w:type="spellEnd"/>
-      <w:r>
-        <w:t xml:space="preserve">, Plati, </w:t>
-      </w:r>
-      <w:proofErr w:type="spellStart"/>
-      <w:r>
-        <w:t>Angajati</w:t>
-      </w:r>
-      <w:proofErr w:type="spellEnd"/>
-      <w:r>
-        <w:t xml:space="preserve">, </w:t>
-      </w:r>
-      <w:proofErr w:type="spellStart"/>
-      <w:r>
-        <w:t>Evenimente</w:t>
-      </w:r>
-      <w:proofErr w:type="spellEnd"/>
-      <w:r>
-        <w:t xml:space="preserve">, Tip Camere, Sali </w:t>
-      </w:r>
-      <w:proofErr w:type="spellStart"/>
-      <w:r>
-        <w:t>Evenimente</w:t>
-      </w:r>
-      <w:proofErr w:type="spellEnd"/>
-      <w:r>
-        <w:t xml:space="preserve">, </w:t>
-      </w:r>
-      <w:proofErr w:type="spellStart"/>
-      <w:r>
-        <w:t>Departamente</w:t>
-      </w:r>
-      <w:proofErr w:type="spellEnd"/>
+        <w:t xml:space="preserve">obligatoriu </w:t>
+      </w:r>
+    </w:p>
+    <w:p>
+      <w:r>
+        <w:t>Modelul de bază de date reprezinta un sistem de gestiune pentru o unitate hoteliera care ofera servicii de cazare, organizare evenimente si servicii suplimentare(spa, fitness, etc).</w:t>
+      </w:r>
+    </w:p>
+    <w:p>
+      <w:r>
+        <w:t>Sistemul OLTP are rolul de a asigura gestionarea operatiunilor zilnice ale hotelului de la rezervarea camerelor si inregistrarea clientilor pana la procesarea platilor si gestionarea evenimentelor. Principalele entitati implicatie in sistem sunt: Clienti, Rezervari, Camere, Servicii, Plati, Angajati, Evenimente</w:t>
+      </w:r>
+      <w:r>
+        <w:t>, Tip Camere, Sali Evenimente, Departamente</w:t>
+      </w:r>
       <w:r>
         <w:t>.</w:t>
       </w:r>
     </w:p>
     <w:p>
-      <w:proofErr w:type="spellStart"/>
-      <w:r>
-        <w:t>Scopul</w:t>
-      </w:r>
-      <w:proofErr w:type="spellEnd"/>
-      <w:r>
-        <w:t xml:space="preserve"> principal al </w:t>
-      </w:r>
-      <w:proofErr w:type="spellStart"/>
-      <w:r>
-        <w:t>aplicatiei</w:t>
-      </w:r>
-      <w:proofErr w:type="spellEnd"/>
-      <w:r>
-        <w:t xml:space="preserve"> este </w:t>
-      </w:r>
-      <w:proofErr w:type="spellStart"/>
-      <w:r>
-        <w:t>crearea</w:t>
-      </w:r>
-      <w:proofErr w:type="spellEnd"/>
-      <w:r>
-        <w:t xml:space="preserve"> </w:t>
-      </w:r>
-      <w:proofErr w:type="spellStart"/>
-      <w:r>
-        <w:t>unui</w:t>
-      </w:r>
-      <w:proofErr w:type="spellEnd"/>
-      <w:r>
-        <w:t xml:space="preserve"> </w:t>
-      </w:r>
-      <w:proofErr w:type="spellStart"/>
-      <w:r>
-        <w:t>depozit</w:t>
-      </w:r>
-      <w:proofErr w:type="spellEnd"/>
-      <w:r>
-        <w:t xml:space="preserve"> de date care </w:t>
-      </w:r>
-      <w:proofErr w:type="spellStart"/>
-      <w:r>
-        <w:t>sa</w:t>
-      </w:r>
-      <w:proofErr w:type="spellEnd"/>
-      <w:r>
-        <w:t xml:space="preserve"> permita analiza </w:t>
-      </w:r>
-      <w:proofErr w:type="spellStart"/>
-      <w:r>
-        <w:t>detaliata</w:t>
-      </w:r>
-      <w:proofErr w:type="spellEnd"/>
-      <w:r>
-        <w:t xml:space="preserve"> </w:t>
-      </w:r>
-      <w:proofErr w:type="gramStart"/>
-      <w:r>
-        <w:t xml:space="preserve">a  </w:t>
-      </w:r>
-      <w:proofErr w:type="spellStart"/>
-      <w:r>
-        <w:t>activitatii</w:t>
-      </w:r>
-      <w:proofErr w:type="spellEnd"/>
-      <w:proofErr w:type="gramEnd"/>
-      <w:r>
-        <w:t xml:space="preserve"> </w:t>
-      </w:r>
-      <w:proofErr w:type="spellStart"/>
-      <w:r>
-        <w:t>hoteliere</w:t>
-      </w:r>
-      <w:proofErr w:type="spellEnd"/>
-      <w:r>
-        <w:t>.</w:t>
+      <w:r>
+        <w:t>Scopul principal al aplicatiei este crearea unui depozit de date care sa permita analiza detaliata a  activitatii hoteliere.</w:t>
       </w:r>
     </w:p>
     <w:p>
@@ -662,69 +167,8 @@
         </w:rPr>
         <w:t xml:space="preserve">(1p) </w:t>
       </w:r>
-      <w:proofErr w:type="spellStart"/>
-      <w:r>
-        <w:t>Diagramele</w:t>
-      </w:r>
-      <w:proofErr w:type="spellEnd"/>
-      <w:r>
-        <w:t xml:space="preserve"> </w:t>
-      </w:r>
-      <w:proofErr w:type="spellStart"/>
-      <w:r>
-        <w:t>bazei</w:t>
-      </w:r>
-      <w:proofErr w:type="spellEnd"/>
-      <w:r>
-        <w:t xml:space="preserve"> de date OLTP </w:t>
-      </w:r>
-      <w:proofErr w:type="spellStart"/>
-      <w:r>
-        <w:t>inițiale</w:t>
-      </w:r>
-      <w:proofErr w:type="spellEnd"/>
-      <w:r>
-        <w:t xml:space="preserve">, care va fi </w:t>
-      </w:r>
-      <w:proofErr w:type="spellStart"/>
-      <w:r>
-        <w:t>utilizată</w:t>
-      </w:r>
-      <w:proofErr w:type="spellEnd"/>
-      <w:r>
-        <w:t xml:space="preserve"> ca </w:t>
-      </w:r>
-      <w:proofErr w:type="spellStart"/>
-      <w:r>
-        <w:t>bază</w:t>
-      </w:r>
-      <w:proofErr w:type="spellEnd"/>
-      <w:r>
-        <w:t xml:space="preserve"> </w:t>
-      </w:r>
-      <w:proofErr w:type="spellStart"/>
-      <w:r>
-        <w:t>pentru</w:t>
-      </w:r>
-      <w:proofErr w:type="spellEnd"/>
-      <w:r>
-        <w:t xml:space="preserve"> </w:t>
-      </w:r>
-      <w:proofErr w:type="spellStart"/>
-      <w:r>
-        <w:t>distribuirea</w:t>
-      </w:r>
-      <w:proofErr w:type="spellEnd"/>
-      <w:r>
-        <w:t xml:space="preserve"> </w:t>
-      </w:r>
-      <w:proofErr w:type="spellStart"/>
-      <w:r>
-        <w:t>datelor</w:t>
-      </w:r>
-      <w:proofErr w:type="spellEnd"/>
-      <w:r>
-        <w:t>.</w:t>
+      <w:r>
+        <w:t>Diagramele bazei de date OLTP inițiale, care va fi utilizată ca bază pentru distribuirea datelor.</w:t>
       </w:r>
       <w:r>
         <w:rPr>
@@ -753,110 +197,14 @@
         <w:t xml:space="preserve">(0,5p) </w:t>
       </w:r>
       <w:r>
-        <w:t xml:space="preserve">Diagrama </w:t>
-      </w:r>
-      <w:proofErr w:type="spellStart"/>
-      <w:r>
-        <w:t>entitate</w:t>
-      </w:r>
-      <w:proofErr w:type="spellEnd"/>
-      <w:r>
-        <w:t xml:space="preserve"> – </w:t>
-      </w:r>
-      <w:proofErr w:type="spellStart"/>
-      <w:r>
-        <w:t>relație</w:t>
-      </w:r>
-      <w:proofErr w:type="spellEnd"/>
-      <w:r>
-        <w:t xml:space="preserve"> a </w:t>
-      </w:r>
-      <w:proofErr w:type="spellStart"/>
-      <w:r>
-        <w:t>bazei</w:t>
-      </w:r>
-      <w:proofErr w:type="spellEnd"/>
-      <w:r>
-        <w:t xml:space="preserve"> de date OLTP </w:t>
-      </w:r>
-      <w:proofErr w:type="spellStart"/>
-      <w:r>
-        <w:t>inițiale</w:t>
-      </w:r>
-      <w:proofErr w:type="spellEnd"/>
-      <w:r>
-        <w:t xml:space="preserve"> (</w:t>
-      </w:r>
-      <w:proofErr w:type="spellStart"/>
-      <w:r>
-        <w:t>minim</w:t>
-      </w:r>
-      <w:proofErr w:type="spellEnd"/>
-      <w:r>
-        <w:t xml:space="preserve"> 10 </w:t>
-      </w:r>
-      <w:proofErr w:type="spellStart"/>
-      <w:r>
-        <w:t>entități</w:t>
-      </w:r>
-      <w:proofErr w:type="spellEnd"/>
-      <w:r>
-        <w:t xml:space="preserve"> independente; </w:t>
-      </w:r>
-      <w:proofErr w:type="spellStart"/>
-      <w:r>
-        <w:t>minim</w:t>
-      </w:r>
-      <w:proofErr w:type="spellEnd"/>
-      <w:r>
-        <w:t xml:space="preserve"> o </w:t>
-      </w:r>
-      <w:proofErr w:type="spellStart"/>
-      <w:r>
-        <w:t>relație</w:t>
-      </w:r>
-      <w:proofErr w:type="spellEnd"/>
-      <w:r>
-        <w:t xml:space="preserve"> de </w:t>
-      </w:r>
-      <w:proofErr w:type="spellStart"/>
-      <w:r>
-        <w:t>tip</w:t>
-      </w:r>
-      <w:proofErr w:type="spellEnd"/>
-      <w:r>
-        <w:t xml:space="preserve"> </w:t>
-      </w:r>
-      <w:proofErr w:type="spellStart"/>
-      <w:r>
-        <w:t>many-to-many</w:t>
-      </w:r>
-      <w:proofErr w:type="spellEnd"/>
-      <w:r>
-        <w:t>; normalizare FN3)</w:t>
+        <w:t>Diagrama entitate – relație a bazei de date OLTP inițiale (minim 10 entități independente; minim o relație de tip many-to-many; normalizare FN3)</w:t>
       </w:r>
       <w:r>
         <w:rPr>
           <w:b/>
           <w:bCs/>
         </w:rPr>
-        <w:t xml:space="preserve"> - </w:t>
-      </w:r>
-      <w:proofErr w:type="spellStart"/>
-      <w:r>
-        <w:rPr>
-          <w:b/>
-          <w:bCs/>
-        </w:rPr>
-        <w:t>obligatoriu</w:t>
-      </w:r>
-      <w:proofErr w:type="spellEnd"/>
-      <w:r>
-        <w:rPr>
-          <w:b/>
-          <w:bCs/>
-        </w:rPr>
-        <w:t xml:space="preserve"> </w:t>
+        <w:t xml:space="preserve"> - obligatoriu </w:t>
       </w:r>
     </w:p>
     <w:p>
@@ -873,10 +221,10 @@
           <w:noProof/>
         </w:rPr>
         <w:drawing>
-          <wp:inline distT="0" distB="0" distL="0" distR="0" wp14:anchorId="63D91D8D" wp14:editId="08DCEABA">
-            <wp:extent cx="6858000" cy="4590415"/>
-            <wp:effectExtent l="0" t="0" r="0" b="635"/>
-            <wp:docPr id="770513288" name="Picture 2"/>
+          <wp:inline distT="0" distB="0" distL="0" distR="0" wp14:anchorId="7E17EB21" wp14:editId="0A977D4F">
+            <wp:extent cx="6858000" cy="3914140"/>
+            <wp:effectExtent l="0" t="0" r="0" b="0"/>
+            <wp:docPr id="592461196" name="Picture 1"/>
             <wp:cNvGraphicFramePr>
               <a:graphicFrameLocks xmlns:a="http://schemas.openxmlformats.org/drawingml/2006/main" noChangeAspect="1"/>
             </wp:cNvGraphicFramePr>
@@ -884,7 +232,7 @@
               <a:graphicData uri="http://schemas.openxmlformats.org/drawingml/2006/picture">
                 <pic:pic xmlns:pic="http://schemas.openxmlformats.org/drawingml/2006/picture">
                   <pic:nvPicPr>
-                    <pic:cNvPr id="0" name="Picture 3"/>
+                    <pic:cNvPr id="0" name="Picture 1"/>
                     <pic:cNvPicPr>
                       <a:picLocks noChangeAspect="1" noChangeArrowheads="1"/>
                     </pic:cNvPicPr>
@@ -905,7 +253,7 @@
                   <pic:spPr bwMode="auto">
                     <a:xfrm>
                       <a:off x="0" y="0"/>
-                      <a:ext cx="6858000" cy="4590415"/>
+                      <a:ext cx="6858000" cy="3914140"/>
                     </a:xfrm>
                     <a:prstGeom prst="rect">
                       <a:avLst/>
@@ -934,29 +282,11 @@
           <w:b/>
           <w:bCs/>
         </w:rPr>
-        <w:lastRenderedPageBreak/>
         <w:t xml:space="preserve">(0,5p) </w:t>
       </w:r>
       <w:r>
-        <w:t xml:space="preserve">Diagrama </w:t>
-      </w:r>
-      <w:proofErr w:type="spellStart"/>
-      <w:r>
-        <w:t>conceptuală</w:t>
-      </w:r>
-      <w:proofErr w:type="spellEnd"/>
-      <w:r>
-        <w:t xml:space="preserve"> a </w:t>
-      </w:r>
-      <w:proofErr w:type="spellStart"/>
-      <w:r>
-        <w:t>bazei</w:t>
-      </w:r>
-      <w:proofErr w:type="spellEnd"/>
-      <w:r>
-        <w:t xml:space="preserve"> de date OLTP – </w:t>
-      </w:r>
-      <w:proofErr w:type="spellStart"/>
+        <w:t xml:space="preserve">Diagrama conceptuală a bazei de date OLTP – </w:t>
+      </w:r>
       <w:r>
         <w:rPr>
           <w:b/>
@@ -964,13 +294,13 @@
         </w:rPr>
         <w:t>obligatoriu</w:t>
       </w:r>
-      <w:proofErr w:type="spellEnd"/>
       <w:r>
         <w:t> </w:t>
       </w:r>
     </w:p>
     <w:p>
       <w:r>
+        <w:lastRenderedPageBreak/>
         <w:t xml:space="preserve">                </w:t>
       </w:r>
       <w:r>
@@ -978,10 +308,10 @@
           <w:noProof/>
         </w:rPr>
         <w:drawing>
-          <wp:inline distT="0" distB="0" distL="0" distR="0" wp14:anchorId="30005D00" wp14:editId="630CD48C">
-            <wp:extent cx="6858000" cy="4445635"/>
+          <wp:inline distT="0" distB="0" distL="0" distR="0" wp14:anchorId="3528F089" wp14:editId="0572F1FD">
+            <wp:extent cx="6858000" cy="4458335"/>
             <wp:effectExtent l="0" t="0" r="0" b="0"/>
-            <wp:docPr id="76628168" name="Picture 1"/>
+            <wp:docPr id="1833084765" name="Picture 2"/>
             <wp:cNvGraphicFramePr>
               <a:graphicFrameLocks xmlns:a="http://schemas.openxmlformats.org/drawingml/2006/main" noChangeAspect="1"/>
             </wp:cNvGraphicFramePr>
@@ -989,7 +319,7 @@
               <a:graphicData uri="http://schemas.openxmlformats.org/drawingml/2006/picture">
                 <pic:pic xmlns:pic="http://schemas.openxmlformats.org/drawingml/2006/picture">
                   <pic:nvPicPr>
-                    <pic:cNvPr id="0" name="Picture 1"/>
+                    <pic:cNvPr id="0" name="Picture 3"/>
                     <pic:cNvPicPr>
                       <a:picLocks noChangeAspect="1" noChangeArrowheads="1"/>
                     </pic:cNvPicPr>
@@ -1010,7 +340,7 @@
                   <pic:spPr bwMode="auto">
                     <a:xfrm>
                       <a:off x="0" y="0"/>
-                      <a:ext cx="6858000" cy="4445635"/>
+                      <a:ext cx="6858000" cy="4458335"/>
                     </a:xfrm>
                     <a:prstGeom prst="rect">
                       <a:avLst/>
@@ -1307,118 +637,20 @@
         </w:rPr>
       </w:pPr>
       <w:r>
+        <w:t>Schema bazei de date conține relația HOTEL, care stochează informațiile despre hotelurile gestionate de sistem.</w:t>
+      </w:r>
+    </w:p>
+    <w:p>
+      <w:pPr>
+        <w:ind w:left="720"/>
+        <w:rPr>
+          <w:noProof/>
+          <w:lang w:val="en-US"/>
+        </w:rPr>
+      </w:pPr>
+      <w:r>
         <w:lastRenderedPageBreak/>
-        <w:t xml:space="preserve">Schema </w:t>
-      </w:r>
-      <w:proofErr w:type="spellStart"/>
-      <w:r>
-        <w:t>bazei</w:t>
-      </w:r>
-      <w:proofErr w:type="spellEnd"/>
-      <w:r>
-        <w:t xml:space="preserve"> de date </w:t>
-      </w:r>
-      <w:proofErr w:type="spellStart"/>
-      <w:r>
-        <w:t>conține</w:t>
-      </w:r>
-      <w:proofErr w:type="spellEnd"/>
-      <w:r>
-        <w:t xml:space="preserve"> </w:t>
-      </w:r>
-      <w:proofErr w:type="spellStart"/>
-      <w:r>
-        <w:t>relația</w:t>
-      </w:r>
-      <w:proofErr w:type="spellEnd"/>
-      <w:r>
-        <w:t xml:space="preserve"> HOTEL, care </w:t>
-      </w:r>
-      <w:proofErr w:type="spellStart"/>
-      <w:r>
-        <w:t>stochează</w:t>
-      </w:r>
-      <w:proofErr w:type="spellEnd"/>
-      <w:r>
-        <w:t xml:space="preserve"> </w:t>
-      </w:r>
-      <w:proofErr w:type="spellStart"/>
-      <w:r>
-        <w:t>informațiile</w:t>
-      </w:r>
-      <w:proofErr w:type="spellEnd"/>
-      <w:r>
-        <w:t xml:space="preserve"> despre </w:t>
-      </w:r>
-      <w:proofErr w:type="spellStart"/>
-      <w:r>
-        <w:t>hotelurile</w:t>
-      </w:r>
-      <w:proofErr w:type="spellEnd"/>
-      <w:r>
-        <w:t xml:space="preserve"> </w:t>
-      </w:r>
-      <w:proofErr w:type="spellStart"/>
-      <w:r>
-        <w:t>gestionate</w:t>
-      </w:r>
-      <w:proofErr w:type="spellEnd"/>
-      <w:r>
-        <w:t xml:space="preserve"> de </w:t>
-      </w:r>
-      <w:proofErr w:type="spellStart"/>
-      <w:r>
-        <w:t>sistem</w:t>
-      </w:r>
-      <w:proofErr w:type="spellEnd"/>
-      <w:r>
-        <w:t>.</w:t>
-      </w:r>
-    </w:p>
-    <w:p>
-      <w:pPr>
-        <w:ind w:left="720"/>
-        <w:rPr>
-          <w:noProof/>
-          <w:lang w:val="en-US"/>
-        </w:rPr>
-      </w:pPr>
-      <w:proofErr w:type="gramStart"/>
-      <w:r>
-        <w:t>HOTEL(</w:t>
-      </w:r>
-      <w:proofErr w:type="spellStart"/>
-      <w:proofErr w:type="gramEnd"/>
-      <w:r>
-        <w:t>id_hotel</w:t>
-      </w:r>
-      <w:proofErr w:type="spellEnd"/>
-      <w:r>
-        <w:t xml:space="preserve">, </w:t>
-      </w:r>
-      <w:proofErr w:type="spellStart"/>
-      <w:r>
-        <w:t>nume_hotel</w:t>
-      </w:r>
-      <w:proofErr w:type="spellEnd"/>
-      <w:r>
-        <w:t xml:space="preserve">, oras, </w:t>
-      </w:r>
-      <w:proofErr w:type="spellStart"/>
-      <w:r>
-        <w:t>nr_stele</w:t>
-      </w:r>
-      <w:proofErr w:type="spellEnd"/>
-      <w:r>
-        <w:t xml:space="preserve">, </w:t>
-      </w:r>
-      <w:proofErr w:type="spellStart"/>
-      <w:r>
-        <w:t>capacitate</w:t>
-      </w:r>
-      <w:proofErr w:type="spellEnd"/>
-      <w:r>
-        <w:t>)</w:t>
+        <w:t>HOTEL(id_hotel, nume_hotel, oras, nr_stele, capacitate)</w:t>
       </w:r>
       <w:r>
         <w:rPr>
@@ -1481,7 +713,6 @@
                 <w:lang w:val="en-GB" w:eastAsia="en-GB"/>
               </w:rPr>
             </w:pPr>
-            <w:proofErr w:type="spellStart"/>
             <w:r>
               <w:rPr>
                 <w:rFonts w:ascii="Aptos Narrow" w:eastAsia="Times New Roman" w:hAnsi="Aptos Narrow" w:cs="Times New Roman"/>
@@ -1492,7 +723,6 @@
               </w:rPr>
               <w:t>id_hotel</w:t>
             </w:r>
-            <w:proofErr w:type="spellEnd"/>
           </w:p>
         </w:tc>
         <w:tc>
@@ -1513,7 +743,6 @@
                 <w:lang w:val="en-GB" w:eastAsia="en-GB"/>
               </w:rPr>
             </w:pPr>
-            <w:proofErr w:type="spellStart"/>
             <w:r>
               <w:rPr>
                 <w:rFonts w:ascii="Aptos Narrow" w:eastAsia="Times New Roman" w:hAnsi="Aptos Narrow" w:cs="Times New Roman"/>
@@ -1524,7 +753,6 @@
               </w:rPr>
               <w:t>nume_hotel</w:t>
             </w:r>
-            <w:proofErr w:type="spellEnd"/>
           </w:p>
         </w:tc>
         <w:tc>
@@ -1545,7 +773,6 @@
                 <w:lang w:val="en-GB" w:eastAsia="en-GB"/>
               </w:rPr>
             </w:pPr>
-            <w:proofErr w:type="spellStart"/>
             <w:r>
               <w:rPr>
                 <w:rFonts w:ascii="Aptos Narrow" w:eastAsia="Times New Roman" w:hAnsi="Aptos Narrow" w:cs="Times New Roman"/>
@@ -1556,7 +783,6 @@
               </w:rPr>
               <w:t>oras</w:t>
             </w:r>
-            <w:proofErr w:type="spellEnd"/>
           </w:p>
         </w:tc>
         <w:tc>
@@ -1577,7 +803,6 @@
                 <w:lang w:val="en-GB" w:eastAsia="en-GB"/>
               </w:rPr>
             </w:pPr>
-            <w:proofErr w:type="spellStart"/>
             <w:r>
               <w:rPr>
                 <w:rFonts w:ascii="Aptos Narrow" w:eastAsia="Times New Roman" w:hAnsi="Aptos Narrow" w:cs="Times New Roman"/>
@@ -1588,7 +813,6 @@
               </w:rPr>
               <w:t>nr_stele</w:t>
             </w:r>
-            <w:proofErr w:type="spellEnd"/>
           </w:p>
         </w:tc>
         <w:tc>
@@ -1676,18 +900,8 @@
                 <w:color w:val="000000"/>
                 <w:lang w:val="en-GB" w:eastAsia="en-GB"/>
               </w:rPr>
-              <w:t xml:space="preserve">Grand Hotel </w:t>
-            </w:r>
-            <w:proofErr w:type="spellStart"/>
-            <w:r>
-              <w:rPr>
-                <w:rFonts w:ascii="Aptos Narrow" w:eastAsia="Times New Roman" w:hAnsi="Aptos Narrow" w:cs="Times New Roman"/>
-                <w:color w:val="000000"/>
-                <w:lang w:val="en-GB" w:eastAsia="en-GB"/>
-              </w:rPr>
-              <w:t>Bucuresti</w:t>
-            </w:r>
-            <w:proofErr w:type="spellEnd"/>
+              <w:t>Grand Hotel Bucuresti</w:t>
+            </w:r>
           </w:p>
         </w:tc>
         <w:tc>
@@ -1706,7 +920,6 @@
                 <w:lang w:val="en-GB" w:eastAsia="en-GB"/>
               </w:rPr>
             </w:pPr>
-            <w:proofErr w:type="spellStart"/>
             <w:r>
               <w:rPr>
                 <w:rFonts w:ascii="Aptos Narrow" w:eastAsia="Times New Roman" w:hAnsi="Aptos Narrow" w:cs="Times New Roman"/>
@@ -1715,7 +928,6 @@
               </w:rPr>
               <w:t>Bucuresti</w:t>
             </w:r>
-            <w:proofErr w:type="spellEnd"/>
           </w:p>
         </w:tc>
         <w:tc>
@@ -2230,22 +1442,22 @@
           <w:noProof/>
           <w:lang w:val="en-US"/>
         </w:rPr>
+        <w:t>q3: „Verifică numărul de stele și capacitatea hotelului din București" → accesează HOTEL cu predicatul oras = 'București'</w:t>
+      </w:r>
+    </w:p>
+    <w:p>
+      <w:pPr>
+        <w:rPr>
+          <w:noProof/>
+          <w:lang w:val="en-US"/>
+        </w:rPr>
+      </w:pPr>
+      <w:r>
+        <w:rPr>
+          <w:noProof/>
+          <w:lang w:val="en-US"/>
+        </w:rPr>
         <w:lastRenderedPageBreak/>
-        <w:t>q3: „Verifică numărul de stele și capacitatea hotelului din București" → accesează HOTEL cu predicatul oras = 'București'</w:t>
-      </w:r>
-    </w:p>
-    <w:p>
-      <w:pPr>
-        <w:rPr>
-          <w:noProof/>
-          <w:lang w:val="en-US"/>
-        </w:rPr>
-      </w:pPr>
-      <w:r>
-        <w:rPr>
-          <w:noProof/>
-          <w:lang w:val="en-US"/>
-        </w:rPr>
         <w:t>q4: „Verifică numărul de stele și capacitatea hotelului din Constanța" → accesează HOTEL cu predicatul oras = 'Constanța'</w:t>
       </w:r>
     </w:p>
@@ -2584,22 +1796,22 @@
           <w:noProof/>
           <w:lang w:val="en-US"/>
         </w:rPr>
+        <w:t>Algoritmul COM_MIN</w:t>
+      </w:r>
+    </w:p>
+    <w:p>
+      <w:pPr>
+        <w:rPr>
+          <w:noProof/>
+          <w:lang w:val="en-US"/>
+        </w:rPr>
+      </w:pPr>
+      <w:r>
+        <w:rPr>
+          <w:noProof/>
+          <w:lang w:val="en-US"/>
+        </w:rPr>
         <w:lastRenderedPageBreak/>
-        <w:t>Algoritmul COM_MIN</w:t>
-      </w:r>
-    </w:p>
-    <w:p>
-      <w:pPr>
-        <w:rPr>
-          <w:noProof/>
-          <w:lang w:val="en-US"/>
-        </w:rPr>
-      </w:pPr>
-      <w:r>
-        <w:rPr>
-          <w:noProof/>
-          <w:lang w:val="en-US"/>
-        </w:rPr>
         <w:t>Input:</w:t>
       </w:r>
     </w:p>
@@ -3024,22 +2236,22 @@
           <w:noProof/>
           <w:lang w:val="en-US"/>
         </w:rPr>
+        <w:t>Algoritmul PRIM_ORIZ</w:t>
+      </w:r>
+    </w:p>
+    <w:p>
+      <w:pPr>
+        <w:rPr>
+          <w:noProof/>
+          <w:lang w:val="en-US"/>
+        </w:rPr>
+      </w:pPr>
+      <w:r>
+        <w:rPr>
+          <w:noProof/>
+          <w:lang w:val="en-US"/>
+        </w:rPr>
         <w:lastRenderedPageBreak/>
-        <w:t>Algoritmul PRIM_ORIZ</w:t>
-      </w:r>
-    </w:p>
-    <w:p>
-      <w:pPr>
-        <w:rPr>
-          <w:noProof/>
-          <w:lang w:val="en-US"/>
-        </w:rPr>
-      </w:pPr>
-      <w:r>
-        <w:rPr>
-          <w:noProof/>
-          <w:lang w:val="en-US"/>
-        </w:rPr>
         <w:t>Input:</w:t>
       </w:r>
     </w:p>
@@ -3617,22 +2829,22 @@
           <w:noProof/>
           <w:lang w:val="en-US"/>
         </w:rPr>
+        <w:t>m2: oras = 'București' (simplificat, deoarece ¬(oras = 'Constanța') este redundant conform i1)</w:t>
+      </w:r>
+    </w:p>
+    <w:p>
+      <w:pPr>
+        <w:rPr>
+          <w:noProof/>
+          <w:lang w:val="en-US"/>
+        </w:rPr>
+      </w:pPr>
+      <w:r>
+        <w:rPr>
+          <w:noProof/>
+          <w:lang w:val="en-US"/>
+        </w:rPr>
         <w:lastRenderedPageBreak/>
-        <w:t>m2: oras = 'București' (simplificat, deoarece ¬(oras = 'Constanța') este redundant conform i1)</w:t>
-      </w:r>
-    </w:p>
-    <w:p>
-      <w:pPr>
-        <w:rPr>
-          <w:noProof/>
-          <w:lang w:val="en-US"/>
-        </w:rPr>
-      </w:pPr>
-      <w:r>
-        <w:rPr>
-          <w:noProof/>
-          <w:lang w:val="en-US"/>
-        </w:rPr>
         <w:t>m3: oras = 'Constanța' (simplificat, deoarece ¬(oras = 'București') este redundant conform i2)</w:t>
       </w:r>
     </w:p>
@@ -3766,7 +2978,6 @@
                 <w:lang w:val="en-GB" w:eastAsia="en-GB"/>
               </w:rPr>
             </w:pPr>
-            <w:proofErr w:type="spellStart"/>
             <w:r>
               <w:rPr>
                 <w:rFonts w:eastAsia="Times New Roman"/>
@@ -3776,7 +2987,6 @@
               </w:rPr>
               <w:t>id_hotel</w:t>
             </w:r>
-            <w:proofErr w:type="spellEnd"/>
           </w:p>
         </w:tc>
         <w:tc>
@@ -3802,7 +3012,6 @@
                 <w:lang w:val="en-GB" w:eastAsia="en-GB"/>
               </w:rPr>
             </w:pPr>
-            <w:proofErr w:type="spellStart"/>
             <w:r>
               <w:rPr>
                 <w:rFonts w:eastAsia="Times New Roman"/>
@@ -3812,7 +3021,6 @@
               </w:rPr>
               <w:t>nume_hotel</w:t>
             </w:r>
-            <w:proofErr w:type="spellEnd"/>
           </w:p>
         </w:tc>
         <w:tc>
@@ -3838,7 +3046,6 @@
                 <w:lang w:val="en-GB" w:eastAsia="en-GB"/>
               </w:rPr>
             </w:pPr>
-            <w:proofErr w:type="spellStart"/>
             <w:r>
               <w:rPr>
                 <w:rFonts w:eastAsia="Times New Roman"/>
@@ -3848,7 +3055,6 @@
               </w:rPr>
               <w:t>oras</w:t>
             </w:r>
-            <w:proofErr w:type="spellEnd"/>
           </w:p>
         </w:tc>
         <w:tc>
@@ -3871,7 +3077,6 @@
                 <w:lang w:val="en-GB" w:eastAsia="en-GB"/>
               </w:rPr>
             </w:pPr>
-            <w:proofErr w:type="spellStart"/>
             <w:r>
               <w:rPr>
                 <w:rFonts w:eastAsia="Times New Roman"/>
@@ -3881,7 +3086,6 @@
               </w:rPr>
               <w:t>nr_stele</w:t>
             </w:r>
-            <w:proofErr w:type="spellEnd"/>
           </w:p>
         </w:tc>
         <w:tc>
@@ -3986,19 +3190,8 @@
                 <w:szCs w:val="26"/>
                 <w:lang w:val="en-GB" w:eastAsia="en-GB"/>
               </w:rPr>
-              <w:t xml:space="preserve">Grand Hotel </w:t>
-            </w:r>
-            <w:proofErr w:type="spellStart"/>
-            <w:r>
-              <w:rPr>
-                <w:rFonts w:eastAsia="Times New Roman"/>
-                <w:sz w:val="26"/>
-                <w:szCs w:val="26"/>
-                <w:lang w:val="en-GB" w:eastAsia="en-GB"/>
-              </w:rPr>
-              <w:t>Bucuresti</w:t>
-            </w:r>
-            <w:proofErr w:type="spellEnd"/>
+              <w:t>Grand Hotel Bucuresti</w:t>
+            </w:r>
           </w:p>
         </w:tc>
         <w:tc>
@@ -4024,7 +3217,6 @@
                 <w:lang w:val="en-GB" w:eastAsia="en-GB"/>
               </w:rPr>
             </w:pPr>
-            <w:proofErr w:type="spellStart"/>
             <w:r>
               <w:rPr>
                 <w:rFonts w:eastAsia="Times New Roman"/>
@@ -4034,7 +3226,6 @@
               </w:rPr>
               <w:t>Bucuresti</w:t>
             </w:r>
-            <w:proofErr w:type="spellEnd"/>
           </w:p>
         </w:tc>
         <w:tc>
@@ -4172,7 +3363,6 @@
                 <w:lang w:val="en-GB" w:eastAsia="en-GB"/>
               </w:rPr>
             </w:pPr>
-            <w:proofErr w:type="spellStart"/>
             <w:r>
               <w:rPr>
                 <w:rFonts w:eastAsia="Times New Roman"/>
@@ -4182,7 +3372,6 @@
               </w:rPr>
               <w:t>id_hotel</w:t>
             </w:r>
-            <w:proofErr w:type="spellEnd"/>
           </w:p>
         </w:tc>
         <w:tc>
@@ -4208,7 +3397,6 @@
                 <w:lang w:val="en-GB" w:eastAsia="en-GB"/>
               </w:rPr>
             </w:pPr>
-            <w:proofErr w:type="spellStart"/>
             <w:r>
               <w:rPr>
                 <w:rFonts w:eastAsia="Times New Roman"/>
@@ -4218,7 +3406,6 @@
               </w:rPr>
               <w:t>nume_hotel</w:t>
             </w:r>
-            <w:proofErr w:type="spellEnd"/>
           </w:p>
         </w:tc>
         <w:tc>
@@ -4244,7 +3431,6 @@
                 <w:lang w:val="en-GB" w:eastAsia="en-GB"/>
               </w:rPr>
             </w:pPr>
-            <w:proofErr w:type="spellStart"/>
             <w:r>
               <w:rPr>
                 <w:rFonts w:eastAsia="Times New Roman"/>
@@ -4254,7 +3440,6 @@
               </w:rPr>
               <w:t>oras</w:t>
             </w:r>
-            <w:proofErr w:type="spellEnd"/>
           </w:p>
         </w:tc>
         <w:tc>
@@ -4277,7 +3462,6 @@
                 <w:lang w:val="en-GB" w:eastAsia="en-GB"/>
               </w:rPr>
             </w:pPr>
-            <w:proofErr w:type="spellStart"/>
             <w:r>
               <w:rPr>
                 <w:rFonts w:eastAsia="Times New Roman"/>
@@ -4287,7 +3471,6 @@
               </w:rPr>
               <w:t>nr_stele</w:t>
             </w:r>
-            <w:proofErr w:type="spellEnd"/>
           </w:p>
         </w:tc>
         <w:tc>
@@ -4502,23 +3685,7 @@
         </w:rPr>
       </w:pPr>
       <w:r>
-        <w:t xml:space="preserve">HOTEL2 = </w:t>
-      </w:r>
-      <w:proofErr w:type="gramStart"/>
-      <w:r>
-        <w:t>σ(</w:t>
-      </w:r>
-      <w:proofErr w:type="gramEnd"/>
-      <w:r>
-        <w:t>oras = 'Constanța</w:t>
-      </w:r>
-      <w:proofErr w:type="gramStart"/>
-      <w:r>
-        <w:t>')(</w:t>
-      </w:r>
-      <w:proofErr w:type="gramEnd"/>
-      <w:r>
-        <w:t>HOTEL)</w:t>
+        <w:t>HOTEL2 = σ(oras = 'Constanța')(HOTEL)</w:t>
       </w:r>
     </w:p>
     <w:p>
@@ -4605,7 +3772,6 @@
                 <w:lang w:val="en-GB" w:eastAsia="en-GB"/>
               </w:rPr>
             </w:pPr>
-            <w:proofErr w:type="spellStart"/>
             <w:r>
               <w:rPr>
                 <w:rFonts w:eastAsia="Times New Roman"/>
@@ -4615,7 +3781,6 @@
               </w:rPr>
               <w:t>Stație</w:t>
             </w:r>
-            <w:proofErr w:type="spellEnd"/>
           </w:p>
         </w:tc>
         <w:tc>
@@ -4635,7 +3800,6 @@
                 <w:lang w:val="en-GB" w:eastAsia="en-GB"/>
               </w:rPr>
             </w:pPr>
-            <w:proofErr w:type="spellStart"/>
             <w:r>
               <w:rPr>
                 <w:rFonts w:eastAsia="Times New Roman"/>
@@ -4645,7 +3809,6 @@
               </w:rPr>
               <w:t>Justificare</w:t>
             </w:r>
-            <w:proofErr w:type="spellEnd"/>
           </w:p>
         </w:tc>
       </w:tr>
@@ -4727,7 +3890,6 @@
                 <w:lang w:val="en-GB" w:eastAsia="en-GB"/>
               </w:rPr>
             </w:pPr>
-            <w:proofErr w:type="spellStart"/>
             <w:r>
               <w:rPr>
                 <w:rFonts w:eastAsia="Times New Roman"/>
@@ -4735,157 +3897,7 @@
                 <w:szCs w:val="26"/>
                 <w:lang w:val="en-GB" w:eastAsia="en-GB"/>
               </w:rPr>
-              <w:t>Hotelul</w:t>
-            </w:r>
-            <w:proofErr w:type="spellEnd"/>
-            <w:r>
-              <w:rPr>
-                <w:rFonts w:eastAsia="Times New Roman"/>
-                <w:sz w:val="26"/>
-                <w:szCs w:val="26"/>
-                <w:lang w:val="en-GB" w:eastAsia="en-GB"/>
-              </w:rPr>
-              <w:t xml:space="preserve"> din </w:t>
-            </w:r>
-            <w:proofErr w:type="spellStart"/>
-            <w:r>
-              <w:rPr>
-                <w:rFonts w:eastAsia="Times New Roman"/>
-                <w:sz w:val="26"/>
-                <w:szCs w:val="26"/>
-                <w:lang w:val="en-GB" w:eastAsia="en-GB"/>
-              </w:rPr>
-              <w:t>București</w:t>
-            </w:r>
-            <w:proofErr w:type="spellEnd"/>
-            <w:r>
-              <w:rPr>
-                <w:rFonts w:eastAsia="Times New Roman"/>
-                <w:sz w:val="26"/>
-                <w:szCs w:val="26"/>
-                <w:lang w:val="en-GB" w:eastAsia="en-GB"/>
-              </w:rPr>
-              <w:t xml:space="preserve"> </w:t>
-            </w:r>
-            <w:proofErr w:type="spellStart"/>
-            <w:r>
-              <w:rPr>
-                <w:rFonts w:eastAsia="Times New Roman"/>
-                <w:sz w:val="26"/>
-                <w:szCs w:val="26"/>
-                <w:lang w:val="en-GB" w:eastAsia="en-GB"/>
-              </w:rPr>
-              <w:t>este</w:t>
-            </w:r>
-            <w:proofErr w:type="spellEnd"/>
-            <w:r>
-              <w:rPr>
-                <w:rFonts w:eastAsia="Times New Roman"/>
-                <w:sz w:val="26"/>
-                <w:szCs w:val="26"/>
-                <w:lang w:val="en-GB" w:eastAsia="en-GB"/>
-              </w:rPr>
-              <w:t xml:space="preserve"> </w:t>
-            </w:r>
-            <w:proofErr w:type="spellStart"/>
-            <w:r>
-              <w:rPr>
-                <w:rFonts w:eastAsia="Times New Roman"/>
-                <w:sz w:val="26"/>
-                <w:szCs w:val="26"/>
-                <w:lang w:val="en-GB" w:eastAsia="en-GB"/>
-              </w:rPr>
-              <w:t>gestionat</w:t>
-            </w:r>
-            <w:proofErr w:type="spellEnd"/>
-            <w:r>
-              <w:rPr>
-                <w:rFonts w:eastAsia="Times New Roman"/>
-                <w:sz w:val="26"/>
-                <w:szCs w:val="26"/>
-                <w:lang w:val="en-GB" w:eastAsia="en-GB"/>
-              </w:rPr>
-              <w:t xml:space="preserve"> </w:t>
-            </w:r>
-            <w:proofErr w:type="spellStart"/>
-            <w:r>
-              <w:rPr>
-                <w:rFonts w:eastAsia="Times New Roman"/>
-                <w:sz w:val="26"/>
-                <w:szCs w:val="26"/>
-                <w:lang w:val="en-GB" w:eastAsia="en-GB"/>
-              </w:rPr>
-              <w:t>preponderent</w:t>
-            </w:r>
-            <w:proofErr w:type="spellEnd"/>
-            <w:r>
-              <w:rPr>
-                <w:rFonts w:eastAsia="Times New Roman"/>
-                <w:sz w:val="26"/>
-                <w:szCs w:val="26"/>
-                <w:lang w:val="en-GB" w:eastAsia="en-GB"/>
-              </w:rPr>
-              <w:t xml:space="preserve"> de </w:t>
-            </w:r>
-            <w:proofErr w:type="spellStart"/>
-            <w:r>
-              <w:rPr>
-                <w:rFonts w:eastAsia="Times New Roman"/>
-                <w:sz w:val="26"/>
-                <w:szCs w:val="26"/>
-                <w:lang w:val="en-GB" w:eastAsia="en-GB"/>
-              </w:rPr>
-              <w:t>stația</w:t>
-            </w:r>
-            <w:proofErr w:type="spellEnd"/>
-            <w:r>
-              <w:rPr>
-                <w:rFonts w:eastAsia="Times New Roman"/>
-                <w:sz w:val="26"/>
-                <w:szCs w:val="26"/>
-                <w:lang w:val="en-GB" w:eastAsia="en-GB"/>
-              </w:rPr>
-              <w:t xml:space="preserve"> EU (</w:t>
-            </w:r>
-            <w:proofErr w:type="spellStart"/>
-            <w:r>
-              <w:rPr>
-                <w:rFonts w:eastAsia="Times New Roman"/>
-                <w:sz w:val="26"/>
-                <w:szCs w:val="26"/>
-                <w:lang w:val="en-GB" w:eastAsia="en-GB"/>
-              </w:rPr>
-              <w:t>aplicațiile</w:t>
-            </w:r>
-            <w:proofErr w:type="spellEnd"/>
-            <w:r>
-              <w:rPr>
-                <w:rFonts w:eastAsia="Times New Roman"/>
-                <w:sz w:val="26"/>
-                <w:szCs w:val="26"/>
-                <w:lang w:val="en-GB" w:eastAsia="en-GB"/>
-              </w:rPr>
-              <w:t xml:space="preserve"> q1, q3 </w:t>
-            </w:r>
-            <w:proofErr w:type="spellStart"/>
-            <w:r>
-              <w:rPr>
-                <w:rFonts w:eastAsia="Times New Roman"/>
-                <w:sz w:val="26"/>
-                <w:szCs w:val="26"/>
-                <w:lang w:val="en-GB" w:eastAsia="en-GB"/>
-              </w:rPr>
-              <w:t>lansate</w:t>
-            </w:r>
-            <w:proofErr w:type="spellEnd"/>
-            <w:r>
-              <w:rPr>
-                <w:rFonts w:eastAsia="Times New Roman"/>
-                <w:sz w:val="26"/>
-                <w:szCs w:val="26"/>
-                <w:lang w:val="en-GB" w:eastAsia="en-GB"/>
-              </w:rPr>
-              <w:t xml:space="preserve"> de pe EU)</w:t>
+              <w:t>Hotelul din București este gestionat preponderent de stația EU (aplicațiile q1, q3 lansate de pe EU)</w:t>
             </w:r>
           </w:p>
         </w:tc>
@@ -4965,7 +3977,6 @@
                 <w:lang w:val="en-GB" w:eastAsia="en-GB"/>
               </w:rPr>
             </w:pPr>
-            <w:proofErr w:type="spellStart"/>
             <w:r>
               <w:rPr>
                 <w:rFonts w:eastAsia="Times New Roman"/>
@@ -4973,117 +3984,7 @@
                 <w:szCs w:val="26"/>
                 <w:lang w:val="en-GB" w:eastAsia="en-GB"/>
               </w:rPr>
-              <w:t>Hotelul</w:t>
-            </w:r>
-            <w:proofErr w:type="spellEnd"/>
-            <w:r>
-              <w:rPr>
-                <w:rFonts w:eastAsia="Times New Roman"/>
-                <w:sz w:val="26"/>
-                <w:szCs w:val="26"/>
-                <w:lang w:val="en-GB" w:eastAsia="en-GB"/>
-              </w:rPr>
-              <w:t xml:space="preserve"> din Constanța </w:t>
-            </w:r>
-            <w:proofErr w:type="spellStart"/>
-            <w:r>
-              <w:rPr>
-                <w:rFonts w:eastAsia="Times New Roman"/>
-                <w:sz w:val="26"/>
-                <w:szCs w:val="26"/>
-                <w:lang w:val="en-GB" w:eastAsia="en-GB"/>
-              </w:rPr>
-              <w:t>este</w:t>
-            </w:r>
-            <w:proofErr w:type="spellEnd"/>
-            <w:r>
-              <w:rPr>
-                <w:rFonts w:eastAsia="Times New Roman"/>
-                <w:sz w:val="26"/>
-                <w:szCs w:val="26"/>
-                <w:lang w:val="en-GB" w:eastAsia="en-GB"/>
-              </w:rPr>
-              <w:t xml:space="preserve"> </w:t>
-            </w:r>
-            <w:proofErr w:type="spellStart"/>
-            <w:r>
-              <w:rPr>
-                <w:rFonts w:eastAsia="Times New Roman"/>
-                <w:sz w:val="26"/>
-                <w:szCs w:val="26"/>
-                <w:lang w:val="en-GB" w:eastAsia="en-GB"/>
-              </w:rPr>
-              <w:t>gestionat</w:t>
-            </w:r>
-            <w:proofErr w:type="spellEnd"/>
-            <w:r>
-              <w:rPr>
-                <w:rFonts w:eastAsia="Times New Roman"/>
-                <w:sz w:val="26"/>
-                <w:szCs w:val="26"/>
-                <w:lang w:val="en-GB" w:eastAsia="en-GB"/>
-              </w:rPr>
-              <w:t xml:space="preserve"> </w:t>
-            </w:r>
-            <w:proofErr w:type="spellStart"/>
-            <w:r>
-              <w:rPr>
-                <w:rFonts w:eastAsia="Times New Roman"/>
-                <w:sz w:val="26"/>
-                <w:szCs w:val="26"/>
-                <w:lang w:val="en-GB" w:eastAsia="en-GB"/>
-              </w:rPr>
-              <w:t>preponderent</w:t>
-            </w:r>
-            <w:proofErr w:type="spellEnd"/>
-            <w:r>
-              <w:rPr>
-                <w:rFonts w:eastAsia="Times New Roman"/>
-                <w:sz w:val="26"/>
-                <w:szCs w:val="26"/>
-                <w:lang w:val="en-GB" w:eastAsia="en-GB"/>
-              </w:rPr>
-              <w:t xml:space="preserve"> de </w:t>
-            </w:r>
-            <w:proofErr w:type="spellStart"/>
-            <w:r>
-              <w:rPr>
-                <w:rFonts w:eastAsia="Times New Roman"/>
-                <w:sz w:val="26"/>
-                <w:szCs w:val="26"/>
-                <w:lang w:val="en-GB" w:eastAsia="en-GB"/>
-              </w:rPr>
-              <w:t>stația</w:t>
-            </w:r>
-            <w:proofErr w:type="spellEnd"/>
-            <w:r>
-              <w:rPr>
-                <w:rFonts w:eastAsia="Times New Roman"/>
-                <w:sz w:val="26"/>
-                <w:szCs w:val="26"/>
-                <w:lang w:val="en-GB" w:eastAsia="en-GB"/>
-              </w:rPr>
-              <w:t xml:space="preserve"> APAC (</w:t>
-            </w:r>
-            <w:proofErr w:type="spellStart"/>
-            <w:r>
-              <w:rPr>
-                <w:rFonts w:eastAsia="Times New Roman"/>
-                <w:sz w:val="26"/>
-                <w:szCs w:val="26"/>
-                <w:lang w:val="en-GB" w:eastAsia="en-GB"/>
-              </w:rPr>
-              <w:t>aplicațiile</w:t>
-            </w:r>
-            <w:proofErr w:type="spellEnd"/>
-            <w:r>
-              <w:rPr>
-                <w:rFonts w:eastAsia="Times New Roman"/>
-                <w:sz w:val="26"/>
-                <w:szCs w:val="26"/>
-                <w:lang w:val="en-GB" w:eastAsia="en-GB"/>
-              </w:rPr>
-              <w:t xml:space="preserve"> q2, q4)</w:t>
+              <w:t>Hotelul din Constanța este gestionat preponderent de stația APAC (aplicațiile q2, q4)</w:t>
             </w:r>
           </w:p>
         </w:tc>
@@ -5516,7 +4417,6 @@
                 <w:lang w:val="en-GB" w:eastAsia="en-GB"/>
               </w:rPr>
             </w:pPr>
-            <w:proofErr w:type="spellStart"/>
             <w:r>
               <w:rPr>
                 <w:rFonts w:ascii="Aptos Narrow" w:eastAsia="Times New Roman" w:hAnsi="Aptos Narrow" w:cs="Times New Roman"/>
@@ -5529,7 +4429,6 @@
               </w:rPr>
               <w:t>id_camera</w:t>
             </w:r>
-            <w:proofErr w:type="spellEnd"/>
           </w:p>
         </w:tc>
         <w:tc>
@@ -5558,7 +4457,6 @@
                 <w:lang w:val="en-GB" w:eastAsia="en-GB"/>
               </w:rPr>
             </w:pPr>
-            <w:proofErr w:type="spellStart"/>
             <w:r>
               <w:rPr>
                 <w:rFonts w:ascii="Aptos Narrow" w:eastAsia="Times New Roman" w:hAnsi="Aptos Narrow" w:cs="Times New Roman"/>
@@ -5571,7 +4469,6 @@
               </w:rPr>
               <w:t>nr_camera</w:t>
             </w:r>
-            <w:proofErr w:type="spellEnd"/>
           </w:p>
         </w:tc>
         <w:tc>
@@ -5600,7 +4497,6 @@
                 <w:lang w:val="en-GB" w:eastAsia="en-GB"/>
               </w:rPr>
             </w:pPr>
-            <w:proofErr w:type="spellStart"/>
             <w:r>
               <w:rPr>
                 <w:rFonts w:ascii="Aptos Narrow" w:eastAsia="Times New Roman" w:hAnsi="Aptos Narrow" w:cs="Times New Roman"/>
@@ -5613,7 +4509,6 @@
               </w:rPr>
               <w:t>id_tip_camera</w:t>
             </w:r>
-            <w:proofErr w:type="spellEnd"/>
           </w:p>
         </w:tc>
         <w:tc>
@@ -5642,7 +4537,6 @@
                 <w:lang w:val="en-GB" w:eastAsia="en-GB"/>
               </w:rPr>
             </w:pPr>
-            <w:proofErr w:type="spellStart"/>
             <w:r>
               <w:rPr>
                 <w:rFonts w:ascii="Aptos Narrow" w:eastAsia="Times New Roman" w:hAnsi="Aptos Narrow" w:cs="Times New Roman"/>
@@ -5655,7 +4549,6 @@
               </w:rPr>
               <w:t>id_hotel</w:t>
             </w:r>
-            <w:proofErr w:type="spellEnd"/>
           </w:p>
         </w:tc>
       </w:tr>
@@ -7487,7 +6380,6 @@
                 <w:lang w:val="en-GB" w:eastAsia="en-GB"/>
               </w:rPr>
             </w:pPr>
-            <w:proofErr w:type="spellStart"/>
             <w:r>
               <w:rPr>
                 <w:rFonts w:ascii="Aptos Narrow" w:eastAsia="Times New Roman" w:hAnsi="Aptos Narrow" w:cs="Times New Roman"/>
@@ -7500,7 +6392,6 @@
               </w:rPr>
               <w:t>id_camera</w:t>
             </w:r>
-            <w:proofErr w:type="spellEnd"/>
           </w:p>
         </w:tc>
         <w:tc>
@@ -7529,7 +6420,6 @@
                 <w:lang w:val="en-GB" w:eastAsia="en-GB"/>
               </w:rPr>
             </w:pPr>
-            <w:proofErr w:type="spellStart"/>
             <w:r>
               <w:rPr>
                 <w:rFonts w:ascii="Aptos Narrow" w:eastAsia="Times New Roman" w:hAnsi="Aptos Narrow" w:cs="Times New Roman"/>
@@ -7542,7 +6432,6 @@
               </w:rPr>
               <w:t>nr_camera</w:t>
             </w:r>
-            <w:proofErr w:type="spellEnd"/>
           </w:p>
         </w:tc>
         <w:tc>
@@ -7571,7 +6460,6 @@
                 <w:lang w:val="en-GB" w:eastAsia="en-GB"/>
               </w:rPr>
             </w:pPr>
-            <w:proofErr w:type="spellStart"/>
             <w:r>
               <w:rPr>
                 <w:rFonts w:ascii="Aptos Narrow" w:eastAsia="Times New Roman" w:hAnsi="Aptos Narrow" w:cs="Times New Roman"/>
@@ -7584,7 +6472,6 @@
               </w:rPr>
               <w:t>id_tip_camera</w:t>
             </w:r>
-            <w:proofErr w:type="spellEnd"/>
           </w:p>
         </w:tc>
         <w:tc>
@@ -7613,7 +6500,6 @@
                 <w:lang w:val="en-GB" w:eastAsia="en-GB"/>
               </w:rPr>
             </w:pPr>
-            <w:proofErr w:type="spellStart"/>
             <w:r>
               <w:rPr>
                 <w:rFonts w:ascii="Aptos Narrow" w:eastAsia="Times New Roman" w:hAnsi="Aptos Narrow" w:cs="Times New Roman"/>
@@ -7626,7 +6512,6 @@
               </w:rPr>
               <w:t>id_hotel</w:t>
             </w:r>
-            <w:proofErr w:type="spellEnd"/>
           </w:p>
         </w:tc>
       </w:tr>
@@ -8512,7 +7397,6 @@
                 <w:lang w:val="en-GB" w:eastAsia="en-GB"/>
               </w:rPr>
             </w:pPr>
-            <w:proofErr w:type="spellStart"/>
             <w:r>
               <w:rPr>
                 <w:rFonts w:ascii="Aptos Narrow" w:eastAsia="Times New Roman" w:hAnsi="Aptos Narrow" w:cs="Times New Roman"/>
@@ -8525,7 +7409,6 @@
               </w:rPr>
               <w:t>id_camera</w:t>
             </w:r>
-            <w:proofErr w:type="spellEnd"/>
           </w:p>
         </w:tc>
         <w:tc>
@@ -8554,7 +7437,6 @@
                 <w:lang w:val="en-GB" w:eastAsia="en-GB"/>
               </w:rPr>
             </w:pPr>
-            <w:proofErr w:type="spellStart"/>
             <w:r>
               <w:rPr>
                 <w:rFonts w:ascii="Aptos Narrow" w:eastAsia="Times New Roman" w:hAnsi="Aptos Narrow" w:cs="Times New Roman"/>
@@ -8567,7 +7449,6 @@
               </w:rPr>
               <w:t>nr_camera</w:t>
             </w:r>
-            <w:proofErr w:type="spellEnd"/>
           </w:p>
         </w:tc>
         <w:tc>
@@ -8596,7 +7477,6 @@
                 <w:lang w:val="en-GB" w:eastAsia="en-GB"/>
               </w:rPr>
             </w:pPr>
-            <w:proofErr w:type="spellStart"/>
             <w:r>
               <w:rPr>
                 <w:rFonts w:ascii="Aptos Narrow" w:eastAsia="Times New Roman" w:hAnsi="Aptos Narrow" w:cs="Times New Roman"/>
@@ -8609,7 +7489,6 @@
               </w:rPr>
               <w:t>id_tip_camera</w:t>
             </w:r>
-            <w:proofErr w:type="spellEnd"/>
           </w:p>
         </w:tc>
         <w:tc>
@@ -8638,7 +7517,6 @@
                 <w:lang w:val="en-GB" w:eastAsia="en-GB"/>
               </w:rPr>
             </w:pPr>
-            <w:proofErr w:type="spellStart"/>
             <w:r>
               <w:rPr>
                 <w:rFonts w:ascii="Aptos Narrow" w:eastAsia="Times New Roman" w:hAnsi="Aptos Narrow" w:cs="Times New Roman"/>
@@ -8651,7 +7529,6 @@
               </w:rPr>
               <w:t>id_hotel</w:t>
             </w:r>
-            <w:proofErr w:type="spellEnd"/>
           </w:p>
         </w:tc>
       </w:tr>
@@ -9521,7 +8398,6 @@
                 <w:lang w:val="en-GB" w:eastAsia="en-GB"/>
               </w:rPr>
             </w:pPr>
-            <w:proofErr w:type="spellStart"/>
             <w:r>
               <w:rPr>
                 <w:rFonts w:ascii="Aptos Narrow" w:eastAsia="Times New Roman" w:hAnsi="Aptos Narrow" w:cs="Times New Roman"/>
@@ -9534,7 +8410,6 @@
               </w:rPr>
               <w:t>Stație</w:t>
             </w:r>
-            <w:proofErr w:type="spellEnd"/>
           </w:p>
         </w:tc>
         <w:tc>
@@ -9563,7 +8438,6 @@
                 <w:lang w:val="en-GB" w:eastAsia="en-GB"/>
               </w:rPr>
             </w:pPr>
-            <w:proofErr w:type="spellStart"/>
             <w:r>
               <w:rPr>
                 <w:rFonts w:ascii="Aptos Narrow" w:eastAsia="Times New Roman" w:hAnsi="Aptos Narrow" w:cs="Times New Roman"/>
@@ -9576,7 +8450,6 @@
               </w:rPr>
               <w:t>Justificare</w:t>
             </w:r>
-            <w:proofErr w:type="spellEnd"/>
           </w:p>
         </w:tc>
       </w:tr>
@@ -9681,137 +8554,15 @@
                 <w:lang w:val="en-GB" w:eastAsia="en-GB"/>
               </w:rPr>
             </w:pPr>
-            <w:proofErr w:type="spellStart"/>
-            <w:r>
-              <w:rPr>
-                <w:rFonts w:ascii="Aptos Narrow" w:eastAsia="Times New Roman" w:hAnsi="Aptos Narrow" w:cs="Times New Roman"/>
-                <w:color w:val="000000"/>
-                <w:sz w:val="24"/>
-                <w:szCs w:val="24"/>
-                <w:lang w:val="en-GB" w:eastAsia="en-GB"/>
-              </w:rPr>
-              <w:t>Camerele</w:t>
-            </w:r>
-            <w:proofErr w:type="spellEnd"/>
-            <w:r>
-              <w:rPr>
-                <w:rFonts w:ascii="Aptos Narrow" w:eastAsia="Times New Roman" w:hAnsi="Aptos Narrow" w:cs="Times New Roman"/>
-                <w:color w:val="000000"/>
-                <w:sz w:val="24"/>
-                <w:szCs w:val="24"/>
-                <w:lang w:val="en-GB" w:eastAsia="en-GB"/>
-              </w:rPr>
-              <w:t xml:space="preserve"> </w:t>
-            </w:r>
-            <w:proofErr w:type="spellStart"/>
-            <w:r>
-              <w:rPr>
-                <w:rFonts w:ascii="Aptos Narrow" w:eastAsia="Times New Roman" w:hAnsi="Aptos Narrow" w:cs="Times New Roman"/>
-                <w:color w:val="000000"/>
-                <w:sz w:val="24"/>
-                <w:szCs w:val="24"/>
-                <w:lang w:val="en-GB" w:eastAsia="en-GB"/>
-              </w:rPr>
-              <w:t>aparțin</w:t>
-            </w:r>
-            <w:proofErr w:type="spellEnd"/>
-            <w:r>
-              <w:rPr>
-                <w:rFonts w:ascii="Aptos Narrow" w:eastAsia="Times New Roman" w:hAnsi="Aptos Narrow" w:cs="Times New Roman"/>
-                <w:color w:val="000000"/>
-                <w:sz w:val="24"/>
-                <w:szCs w:val="24"/>
-                <w:lang w:val="en-GB" w:eastAsia="en-GB"/>
-              </w:rPr>
-              <w:t xml:space="preserve"> </w:t>
-            </w:r>
-            <w:proofErr w:type="spellStart"/>
-            <w:r>
-              <w:rPr>
-                <w:rFonts w:ascii="Aptos Narrow" w:eastAsia="Times New Roman" w:hAnsi="Aptos Narrow" w:cs="Times New Roman"/>
-                <w:color w:val="000000"/>
-                <w:sz w:val="24"/>
-                <w:szCs w:val="24"/>
-                <w:lang w:val="en-GB" w:eastAsia="en-GB"/>
-              </w:rPr>
-              <w:t>hotelului</w:t>
-            </w:r>
-            <w:proofErr w:type="spellEnd"/>
-            <w:r>
-              <w:rPr>
-                <w:rFonts w:ascii="Aptos Narrow" w:eastAsia="Times New Roman" w:hAnsi="Aptos Narrow" w:cs="Times New Roman"/>
-                <w:color w:val="000000"/>
-                <w:sz w:val="24"/>
-                <w:szCs w:val="24"/>
-                <w:lang w:val="en-GB" w:eastAsia="en-GB"/>
-              </w:rPr>
-              <w:t xml:space="preserve"> din </w:t>
-            </w:r>
-            <w:proofErr w:type="spellStart"/>
-            <w:r>
-              <w:rPr>
-                <w:rFonts w:ascii="Aptos Narrow" w:eastAsia="Times New Roman" w:hAnsi="Aptos Narrow" w:cs="Times New Roman"/>
-                <w:color w:val="000000"/>
-                <w:sz w:val="24"/>
-                <w:szCs w:val="24"/>
-                <w:lang w:val="en-GB" w:eastAsia="en-GB"/>
-              </w:rPr>
-              <w:t>București</w:t>
-            </w:r>
-            <w:proofErr w:type="spellEnd"/>
-            <w:r>
-              <w:rPr>
-                <w:rFonts w:ascii="Aptos Narrow" w:eastAsia="Times New Roman" w:hAnsi="Aptos Narrow" w:cs="Times New Roman"/>
-                <w:color w:val="000000"/>
-                <w:sz w:val="24"/>
-                <w:szCs w:val="24"/>
-                <w:lang w:val="en-GB" w:eastAsia="en-GB"/>
-              </w:rPr>
-              <w:t xml:space="preserve">, </w:t>
-            </w:r>
-            <w:proofErr w:type="spellStart"/>
-            <w:r>
-              <w:rPr>
-                <w:rFonts w:ascii="Aptos Narrow" w:eastAsia="Times New Roman" w:hAnsi="Aptos Narrow" w:cs="Times New Roman"/>
-                <w:color w:val="000000"/>
-                <w:sz w:val="24"/>
-                <w:szCs w:val="24"/>
-                <w:lang w:val="en-GB" w:eastAsia="en-GB"/>
-              </w:rPr>
-              <w:t>gestionat</w:t>
-            </w:r>
-            <w:proofErr w:type="spellEnd"/>
-            <w:r>
-              <w:rPr>
-                <w:rFonts w:ascii="Aptos Narrow" w:eastAsia="Times New Roman" w:hAnsi="Aptos Narrow" w:cs="Times New Roman"/>
-                <w:color w:val="000000"/>
-                <w:sz w:val="24"/>
-                <w:szCs w:val="24"/>
-                <w:lang w:val="en-GB" w:eastAsia="en-GB"/>
-              </w:rPr>
-              <w:t xml:space="preserve"> de </w:t>
-            </w:r>
-            <w:proofErr w:type="spellStart"/>
-            <w:r>
-              <w:rPr>
-                <w:rFonts w:ascii="Aptos Narrow" w:eastAsia="Times New Roman" w:hAnsi="Aptos Narrow" w:cs="Times New Roman"/>
-                <w:color w:val="000000"/>
-                <w:sz w:val="24"/>
-                <w:szCs w:val="24"/>
-                <w:lang w:val="en-GB" w:eastAsia="en-GB"/>
-              </w:rPr>
-              <w:t>stația</w:t>
-            </w:r>
-            <w:proofErr w:type="spellEnd"/>
-            <w:r>
-              <w:rPr>
-                <w:rFonts w:ascii="Aptos Narrow" w:eastAsia="Times New Roman" w:hAnsi="Aptos Narrow" w:cs="Times New Roman"/>
-                <w:color w:val="000000"/>
-                <w:sz w:val="24"/>
-                <w:szCs w:val="24"/>
-                <w:lang w:val="en-GB" w:eastAsia="en-GB"/>
-              </w:rPr>
-              <w:t xml:space="preserve"> EU</w:t>
+            <w:r>
+              <w:rPr>
+                <w:rFonts w:ascii="Aptos Narrow" w:eastAsia="Times New Roman" w:hAnsi="Aptos Narrow" w:cs="Times New Roman"/>
+                <w:color w:val="000000"/>
+                <w:sz w:val="24"/>
+                <w:szCs w:val="24"/>
+                <w:lang w:val="en-GB" w:eastAsia="en-GB"/>
+              </w:rPr>
+              <w:t>Camerele aparțin hotelului din București, gestionat de stația EU</w:t>
             </w:r>
           </w:p>
         </w:tc>
@@ -9918,115 +8669,15 @@
                 <w:lang w:val="en-GB" w:eastAsia="en-GB"/>
               </w:rPr>
             </w:pPr>
-            <w:proofErr w:type="spellStart"/>
-            <w:r>
-              <w:rPr>
-                <w:rFonts w:ascii="Aptos Narrow" w:eastAsia="Times New Roman" w:hAnsi="Aptos Narrow" w:cs="Times New Roman"/>
-                <w:color w:val="000000"/>
-                <w:sz w:val="24"/>
-                <w:szCs w:val="24"/>
-                <w:lang w:val="en-GB" w:eastAsia="en-GB"/>
-              </w:rPr>
-              <w:t>Camerele</w:t>
-            </w:r>
-            <w:proofErr w:type="spellEnd"/>
-            <w:r>
-              <w:rPr>
-                <w:rFonts w:ascii="Aptos Narrow" w:eastAsia="Times New Roman" w:hAnsi="Aptos Narrow" w:cs="Times New Roman"/>
-                <w:color w:val="000000"/>
-                <w:sz w:val="24"/>
-                <w:szCs w:val="24"/>
-                <w:lang w:val="en-GB" w:eastAsia="en-GB"/>
-              </w:rPr>
-              <w:t xml:space="preserve"> </w:t>
-            </w:r>
-            <w:proofErr w:type="spellStart"/>
-            <w:r>
-              <w:rPr>
-                <w:rFonts w:ascii="Aptos Narrow" w:eastAsia="Times New Roman" w:hAnsi="Aptos Narrow" w:cs="Times New Roman"/>
-                <w:color w:val="000000"/>
-                <w:sz w:val="24"/>
-                <w:szCs w:val="24"/>
-                <w:lang w:val="en-GB" w:eastAsia="en-GB"/>
-              </w:rPr>
-              <w:t>aparțin</w:t>
-            </w:r>
-            <w:proofErr w:type="spellEnd"/>
-            <w:r>
-              <w:rPr>
-                <w:rFonts w:ascii="Aptos Narrow" w:eastAsia="Times New Roman" w:hAnsi="Aptos Narrow" w:cs="Times New Roman"/>
-                <w:color w:val="000000"/>
-                <w:sz w:val="24"/>
-                <w:szCs w:val="24"/>
-                <w:lang w:val="en-GB" w:eastAsia="en-GB"/>
-              </w:rPr>
-              <w:t xml:space="preserve"> </w:t>
-            </w:r>
-            <w:proofErr w:type="spellStart"/>
-            <w:r>
-              <w:rPr>
-                <w:rFonts w:ascii="Aptos Narrow" w:eastAsia="Times New Roman" w:hAnsi="Aptos Narrow" w:cs="Times New Roman"/>
-                <w:color w:val="000000"/>
-                <w:sz w:val="24"/>
-                <w:szCs w:val="24"/>
-                <w:lang w:val="en-GB" w:eastAsia="en-GB"/>
-              </w:rPr>
-              <w:t>hotelului</w:t>
-            </w:r>
-            <w:proofErr w:type="spellEnd"/>
-            <w:r>
-              <w:rPr>
-                <w:rFonts w:ascii="Aptos Narrow" w:eastAsia="Times New Roman" w:hAnsi="Aptos Narrow" w:cs="Times New Roman"/>
-                <w:color w:val="000000"/>
-                <w:sz w:val="24"/>
-                <w:szCs w:val="24"/>
-                <w:lang w:val="en-GB" w:eastAsia="en-GB"/>
-              </w:rPr>
-              <w:t xml:space="preserve"> din Constanța, </w:t>
-            </w:r>
-            <w:proofErr w:type="spellStart"/>
-            <w:r>
-              <w:rPr>
-                <w:rFonts w:ascii="Aptos Narrow" w:eastAsia="Times New Roman" w:hAnsi="Aptos Narrow" w:cs="Times New Roman"/>
-                <w:color w:val="000000"/>
-                <w:sz w:val="24"/>
-                <w:szCs w:val="24"/>
-                <w:lang w:val="en-GB" w:eastAsia="en-GB"/>
-              </w:rPr>
-              <w:t>gestionat</w:t>
-            </w:r>
-            <w:proofErr w:type="spellEnd"/>
-            <w:r>
-              <w:rPr>
-                <w:rFonts w:ascii="Aptos Narrow" w:eastAsia="Times New Roman" w:hAnsi="Aptos Narrow" w:cs="Times New Roman"/>
-                <w:color w:val="000000"/>
-                <w:sz w:val="24"/>
-                <w:szCs w:val="24"/>
-                <w:lang w:val="en-GB" w:eastAsia="en-GB"/>
-              </w:rPr>
-              <w:t xml:space="preserve"> de </w:t>
-            </w:r>
-            <w:proofErr w:type="spellStart"/>
-            <w:r>
-              <w:rPr>
-                <w:rFonts w:ascii="Aptos Narrow" w:eastAsia="Times New Roman" w:hAnsi="Aptos Narrow" w:cs="Times New Roman"/>
-                <w:color w:val="000000"/>
-                <w:sz w:val="24"/>
-                <w:szCs w:val="24"/>
-                <w:lang w:val="en-GB" w:eastAsia="en-GB"/>
-              </w:rPr>
-              <w:t>stația</w:t>
-            </w:r>
-            <w:proofErr w:type="spellEnd"/>
-            <w:r>
-              <w:rPr>
-                <w:rFonts w:ascii="Aptos Narrow" w:eastAsia="Times New Roman" w:hAnsi="Aptos Narrow" w:cs="Times New Roman"/>
-                <w:color w:val="000000"/>
-                <w:sz w:val="24"/>
-                <w:szCs w:val="24"/>
-                <w:lang w:val="en-GB" w:eastAsia="en-GB"/>
-              </w:rPr>
-              <w:t xml:space="preserve"> APAC</w:t>
+            <w:r>
+              <w:rPr>
+                <w:rFonts w:ascii="Aptos Narrow" w:eastAsia="Times New Roman" w:hAnsi="Aptos Narrow" w:cs="Times New Roman"/>
+                <w:color w:val="000000"/>
+                <w:sz w:val="24"/>
+                <w:szCs w:val="24"/>
+                <w:lang w:val="en-GB" w:eastAsia="en-GB"/>
+              </w:rPr>
+              <w:t>Camerele aparțin hotelului din Constanța, gestionat de stația APAC</w:t>
             </w:r>
           </w:p>
         </w:tc>
@@ -15243,54 +13894,18 @@
           <w:b/>
           <w:bCs/>
         </w:rPr>
-        <w:t xml:space="preserve">B-Tree </w:t>
-      </w:r>
-      <w:proofErr w:type="spellStart"/>
+        <w:t>B-Tree Index pe coloana</w:t>
+      </w:r>
+      <w:r>
+        <w:t xml:space="preserve"> </w:t>
+      </w:r>
       <w:r>
         <w:rPr>
           <w:b/>
           <w:bCs/>
         </w:rPr>
-        <w:t>Index</w:t>
-      </w:r>
-      <w:proofErr w:type="spellEnd"/>
-      <w:r>
-        <w:rPr>
-          <w:b/>
-          <w:bCs/>
-        </w:rPr>
-        <w:t xml:space="preserve"> pe </w:t>
-      </w:r>
-      <w:proofErr w:type="spellStart"/>
-      <w:r>
-        <w:rPr>
-          <w:b/>
-          <w:bCs/>
-        </w:rPr>
-        <w:t>coloana</w:t>
-      </w:r>
-      <w:proofErr w:type="spellEnd"/>
-      <w:r>
-        <w:t xml:space="preserve"> </w:t>
-      </w:r>
-      <w:proofErr w:type="spellStart"/>
-      <w:proofErr w:type="gramStart"/>
-      <w:r>
-        <w:rPr>
-          <w:b/>
-          <w:bCs/>
-        </w:rPr>
-        <w:t>departament.nume</w:t>
-      </w:r>
-      <w:proofErr w:type="gramEnd"/>
-      <w:r>
-        <w:rPr>
-          <w:b/>
-          <w:bCs/>
-        </w:rPr>
-        <w:t>_departament</w:t>
-      </w:r>
-      <w:proofErr w:type="spellEnd"/>
+        <w:t>departament.nume_departament</w:t>
+      </w:r>
     </w:p>
     <w:p>
       <w:pPr>
@@ -15300,16 +13915,11 @@
       <w:r>
         <w:t>DEPARTAMENT (</w:t>
       </w:r>
-      <w:proofErr w:type="spellStart"/>
       <w:r>
         <w:t>nume_departamen</w:t>
       </w:r>
       <w:r>
-        <w:t>t</w:t>
-      </w:r>
-      <w:proofErr w:type="spellEnd"/>
-      <w:r>
-        <w:t>)</w:t>
+        <w:t>t)</w:t>
       </w:r>
     </w:p>
     <w:tbl>
@@ -15342,11 +13952,9 @@
               <w:spacing w:after="0" w:line="240" w:lineRule="auto"/>
               <w:jc w:val="both"/>
             </w:pPr>
-            <w:proofErr w:type="spellStart"/>
             <w:r>
               <w:t>Avantaj</w:t>
             </w:r>
-            <w:proofErr w:type="spellEnd"/>
           </w:p>
         </w:tc>
         <w:tc>
@@ -15359,11 +13967,9 @@
               <w:spacing w:after="0" w:line="240" w:lineRule="auto"/>
               <w:jc w:val="both"/>
             </w:pPr>
-            <w:proofErr w:type="spellStart"/>
             <w:r>
               <w:t>Dezavantaj</w:t>
             </w:r>
-            <w:proofErr w:type="spellEnd"/>
           </w:p>
         </w:tc>
       </w:tr>
@@ -15386,35 +13992,14 @@
                 <w:lang w:val="ro-RO"/>
               </w:rPr>
             </w:pPr>
-            <w:proofErr w:type="spellStart"/>
-            <w:r>
-              <w:t>Reducerea</w:t>
-            </w:r>
-            <w:proofErr w:type="spellEnd"/>
-            <w:r>
-              <w:t xml:space="preserve"> </w:t>
-            </w:r>
-            <w:proofErr w:type="spellStart"/>
-            <w:r>
-              <w:t>timpului</w:t>
-            </w:r>
-            <w:proofErr w:type="spellEnd"/>
-            <w:r>
-              <w:t xml:space="preserve"> de c</w:t>
-            </w:r>
-            <w:proofErr w:type="spellStart"/>
+            <w:r>
+              <w:t>Reducerea timpului de c</w:t>
+            </w:r>
             <w:r>
               <w:rPr>
                 <w:lang w:val="ro-RO"/>
               </w:rPr>
-              <w:t>ăutare</w:t>
-            </w:r>
-            <w:proofErr w:type="spellEnd"/>
-            <w:r>
-              <w:rPr>
-                <w:lang w:val="ro-RO"/>
-              </w:rPr>
-              <w:t xml:space="preserve"> în tabel, deoarece nu se mai face FULL TABLE SCAN.</w:t>
+              <w:t>ăutare în tabel, deoarece nu se mai face FULL TABLE SCAN.</w:t>
             </w:r>
           </w:p>
         </w:tc>
@@ -15433,69 +14018,8 @@
               <w:spacing w:after="0" w:line="240" w:lineRule="auto"/>
               <w:jc w:val="both"/>
             </w:pPr>
-            <w:proofErr w:type="spellStart"/>
-            <w:r>
-              <w:t>Ocupă</w:t>
-            </w:r>
-            <w:proofErr w:type="spellEnd"/>
-            <w:r>
-              <w:t xml:space="preserve"> </w:t>
-            </w:r>
-            <w:proofErr w:type="spellStart"/>
-            <w:r>
-              <w:t>spațiu</w:t>
-            </w:r>
-            <w:proofErr w:type="spellEnd"/>
-            <w:r>
-              <w:t xml:space="preserve"> </w:t>
-            </w:r>
-            <w:proofErr w:type="spellStart"/>
-            <w:r>
-              <w:t>suplimentar</w:t>
-            </w:r>
-            <w:proofErr w:type="spellEnd"/>
-            <w:r>
-              <w:t xml:space="preserve"> </w:t>
-            </w:r>
-            <w:proofErr w:type="spellStart"/>
-            <w:r>
-              <w:t>și</w:t>
-            </w:r>
-            <w:proofErr w:type="spellEnd"/>
-            <w:r>
-              <w:t xml:space="preserve"> </w:t>
-            </w:r>
-            <w:proofErr w:type="spellStart"/>
-            <w:r>
-              <w:t>inserțiile</w:t>
-            </w:r>
-            <w:proofErr w:type="spellEnd"/>
-            <w:r>
-              <w:t>/</w:t>
-            </w:r>
-            <w:proofErr w:type="spellStart"/>
-            <w:r>
-              <w:t>actualizările</w:t>
-            </w:r>
-            <w:proofErr w:type="spellEnd"/>
-            <w:r>
-              <w:t xml:space="preserve"> </w:t>
-            </w:r>
-            <w:proofErr w:type="spellStart"/>
-            <w:r>
-              <w:t>pot</w:t>
-            </w:r>
-            <w:proofErr w:type="spellEnd"/>
-            <w:r>
-              <w:t xml:space="preserve"> fi </w:t>
-            </w:r>
-            <w:proofErr w:type="spellStart"/>
-            <w:r>
-              <w:t>mai</w:t>
-            </w:r>
-            <w:proofErr w:type="spellEnd"/>
-            <w:r>
-              <w:t xml:space="preserve"> lente.</w:t>
+            <w:r>
+              <w:t>Ocupă spațiu suplimentar și inserțiile/actualizările pot fi mai lente.</w:t>
             </w:r>
           </w:p>
         </w:tc>

</xml_diff>